<commit_message>
Cambios en hero, footer y arquitectura
</commit_message>
<xml_diff>
--- a/frontend/Orden-de-creacion-frontend.docx
+++ b/frontend/Orden-de-creacion-frontend.docx
@@ -706,28 +706,164 @@
     </w:p>
     <w:p>
       <w:pPr>
-        <w:pBdr>
-          <w:top w:val="single" w:color="BFBFBF" w:sz="6"/>
-        </w:pBdr>
-        <w:spacing w:before="280"/>
-      </w:pPr>
-    </w:p>
-    <w:p>
-      <w:pPr>
-        <w:spacing w:before="160"/>
+        <w:pStyle w:val="Heading2"/>
+        <w:spacing w:after="120" w:before="280"/>
       </w:pPr>
       <w:r>
         <w:rPr>
           <w:b/>
           <w:bCs/>
         </w:rPr>
-        <w:t xml:space="preserve">Nota: </w:t>
-      </w:r>
-      <w:r>
-        <w:rPr>
+        <w:t xml:space="preserve">9. Actualizaciones posteriores</w:t>
+      </w:r>
+    </w:p>
+    <w:p>
+      <w:pPr>
+        <w:spacing w:after="160"/>
+      </w:pPr>
+      <w:r>
+        <w:rPr>
+          <w:i/>
+          <w:iCs/>
           <w:color w:val="595959"/>
         </w:rPr>
-        <w:t xml:space="preserve">src/data/cursos.js fue editado posteriormente (fuera de este orden de creación) para ajustar los datos de ejemplo — se agregó la categoría "IA" y se cambiaron algunas capacidades y descripciones.</w:t>
+        <w:t xml:space="preserve">Cambios realizados después del orden de creación inicial descrito arriba.</w:t>
+      </w:r>
+    </w:p>
+    <w:p>
+      <w:pPr>
+        <w:pStyle w:val="ListParagraph"/>
+        <w:numPr>
+          <w:ilvl w:val="0"/>
+          <w:numId w:val="2"/>
+        </w:numPr>
+        <w:spacing w:after="60"/>
+      </w:pPr>
+      <w:r>
+        <w:rPr>
+          <w:rFonts w:ascii="Consolas" w:cs="Consolas" w:eastAsia="Consolas" w:hAnsi="Consolas"/>
+          <w:color w:val="1F4E79"/>
+        </w:rPr>
+        <w:t xml:space="preserve">src/data/cursos.js</w:t>
+      </w:r>
+      <w:r>
+        <w:t xml:space="preserve"> — se editó para ajustar los datos de ejemplo: se agregó la categoría "IA" y se cambiaron algunas capacidades y descripciones.</w:t>
+      </w:r>
+    </w:p>
+    <w:p>
+      <w:pPr>
+        <w:pStyle w:val="ListParagraph"/>
+        <w:numPr>
+          <w:ilvl w:val="0"/>
+          <w:numId w:val="2"/>
+        </w:numPr>
+        <w:spacing w:after="60"/>
+      </w:pPr>
+      <w:r>
+        <w:rPr>
+          <w:rFonts w:ascii="Consolas" w:cs="Consolas" w:eastAsia="Consolas" w:hAnsi="Consolas"/>
+          <w:color w:val="1F4E79"/>
+        </w:rPr>
+        <w:t xml:space="preserve">src/assets/images/</w:t>
+      </w:r>
+      <w:r>
+        <w:t xml:space="preserve"> — se agregó la imagen real </w:t>
+      </w:r>
+      <w:r>
+        <w:rPr>
+          <w:rFonts w:ascii="Consolas" w:cs="Consolas" w:eastAsia="Consolas" w:hAnsi="Consolas"/>
+          <w:color w:val="1F4E79"/>
+        </w:rPr>
+        <w:t xml:space="preserve">hero1.jpg</w:t>
+      </w:r>
+      <w:r>
+        <w:t xml:space="preserve">.</w:t>
+      </w:r>
+    </w:p>
+    <w:p>
+      <w:pPr>
+        <w:pStyle w:val="ListParagraph"/>
+        <w:numPr>
+          <w:ilvl w:val="0"/>
+          <w:numId w:val="2"/>
+        </w:numPr>
+        <w:spacing w:after="60"/>
+      </w:pPr>
+      <w:r>
+        <w:rPr>
+          <w:rFonts w:ascii="Consolas" w:cs="Consolas" w:eastAsia="Consolas" w:hAnsi="Consolas"/>
+          <w:color w:val="1F4E79"/>
+        </w:rPr>
+        <w:t xml:space="preserve">src/components/cursos/Hero.jsx</w:t>
+      </w:r>
+      <w:r>
+        <w:t xml:space="preserve"> — se conectó </w:t>
+      </w:r>
+      <w:r>
+        <w:rPr>
+          <w:rFonts w:ascii="Consolas" w:cs="Consolas" w:eastAsia="Consolas" w:hAnsi="Consolas"/>
+          <w:color w:val="1F4E79"/>
+        </w:rPr>
+        <w:t xml:space="preserve">hero1.jpg</w:t>
+      </w:r>
+      <w:r>
+        <w:t xml:space="preserve"> como imagen de fondo del Hero (con overlay oscuro para legibilidad del texto), reemplazando el placeholder gris.</w:t>
+      </w:r>
+    </w:p>
+    <w:p>
+      <w:pPr>
+        <w:pStyle w:val="ListParagraph"/>
+        <w:numPr>
+          <w:ilvl w:val="0"/>
+          <w:numId w:val="2"/>
+        </w:numPr>
+        <w:spacing w:after="60"/>
+      </w:pPr>
+      <w:r>
+        <w:t xml:space="preserve">Se eliminó la carpeta </w:t>
+      </w:r>
+      <w:r>
+        <w:rPr>
+          <w:rFonts w:ascii="Consolas" w:cs="Consolas" w:eastAsia="Consolas" w:hAnsi="Consolas"/>
+          <w:color w:val="1F4E79"/>
+        </w:rPr>
+        <w:t xml:space="preserve">.claude/</w:t>
+      </w:r>
+      <w:r>
+        <w:t xml:space="preserve"> antes del primer commit — era solo configuración local para previsualizar el sitio, no forma parte de la aplicación.</w:t>
+      </w:r>
+    </w:p>
+    <w:p>
+      <w:pPr>
+        <w:pStyle w:val="ListParagraph"/>
+        <w:numPr>
+          <w:ilvl w:val="0"/>
+          <w:numId w:val="2"/>
+        </w:numPr>
+        <w:spacing w:after="60"/>
+      </w:pPr>
+      <w:r>
+        <w:t xml:space="preserve">Control de versiones: se inicializó </w:t>
+      </w:r>
+      <w:r>
+        <w:rPr>
+          <w:rFonts w:ascii="Consolas" w:cs="Consolas" w:eastAsia="Consolas" w:hAnsi="Consolas"/>
+          <w:color w:val="1F4E79"/>
+        </w:rPr>
+        <w:t xml:space="preserve">git</w:t>
+      </w:r>
+      <w:r>
+        <w:t xml:space="preserve"> en la carpeta raíz del proyecto (Desarrollo_beaken), se hizo el primer commit ("Primera version del frontend: seccion de Cursos") y se conectó con el repositorio remoto en GitHub: </w:t>
+      </w:r>
+      <w:r>
+        <w:rPr>
+          <w:rFonts w:ascii="Consolas" w:cs="Consolas" w:eastAsia="Consolas" w:hAnsi="Consolas"/>
+          <w:color w:val="1F4E79"/>
+        </w:rPr>
+        <w:t xml:space="preserve">https://github.com/roccassa/residencias_beaken</w:t>
+      </w:r>
+      <w:r>
+        <w:t xml:space="preserve">.</w:t>
       </w:r>
     </w:p>
     <w:sectPr>

</xml_diff>

<commit_message>
Codificacion de la pagina de inscripcion
</commit_message>
<xml_diff>
--- a/frontend/Orden-de-creacion-frontend.docx
+++ b/frontend/Orden-de-creacion-frontend.docx
@@ -1703,20 +1703,7 @@
           <w:b/>
           <w:bCs/>
         </w:rPr>
-        <w:t xml:space="preserve">16. Estado actual y pendientes</w:t>
-      </w:r>
-    </w:p>
-    <w:p>
-      <w:pPr>
-        <w:pStyle w:val="ListParagraph"/>
-        <w:numPr>
-          <w:ilvl w:val="0"/>
-          <w:numId w:val="2"/>
-        </w:numPr>
-        <w:spacing w:after="60"/>
-      </w:pPr>
-      <w:r>
-        <w:t xml:space="preserve">Historial de commits en GitHub: "Primera version del frontend: seccion de Cursos", "Cambios en hero, footer y arquitectura", "Borrador de Talleres" y "Borrador de Eventos".</w:t>
+        <w:t xml:space="preserve">16. Imágenes de las secciones</w:t>
       </w:r>
     </w:p>
     <w:p>
@@ -1736,7 +1723,7 @@
         <w:t xml:space="preserve">src/assets/images/tu_lugar_espera.jpg</w:t>
       </w:r>
       <w:r>
-        <w:t xml:space="preserve"> — imagen agregada para la sección "Tu lugar te espera"; se conectará manualmente en </w:t>
+        <w:t xml:space="preserve"> — conectada manualmente en </w:t>
       </w:r>
       <w:r>
         <w:rPr>
@@ -1746,20 +1733,597 @@
         <w:t xml:space="preserve">CtaBanner.jsx</w:t>
       </w:r>
       <w:r>
-        <w:t xml:space="preserve"> (pendiente).</w:t>
-      </w:r>
-    </w:p>
-    <w:p>
-      <w:pPr>
-        <w:pStyle w:val="ListParagraph"/>
-        <w:numPr>
-          <w:ilvl w:val="0"/>
-          <w:numId w:val="2"/>
-        </w:numPr>
-        <w:spacing w:after="60"/>
-      </w:pPr>
-      <w:r>
-        <w:t xml:space="preserve">Pendiente: optimizar el peso de </w:t>
+        <w:t xml:space="preserve"> (sección "Tu lugar te espera"), por lo que aparece en Cursos, Talleres y Eventos.</w:t>
+      </w:r>
+    </w:p>
+    <w:p>
+      <w:pPr>
+        <w:pStyle w:val="ListParagraph"/>
+        <w:numPr>
+          <w:ilvl w:val="0"/>
+          <w:numId w:val="2"/>
+        </w:numPr>
+        <w:spacing w:after="60"/>
+      </w:pPr>
+      <w:r>
+        <w:rPr>
+          <w:rFonts w:ascii="Consolas" w:cs="Consolas" w:eastAsia="Consolas" w:hAnsi="Consolas"/>
+          <w:color w:val="1F4E79"/>
+        </w:rPr>
+        <w:t xml:space="preserve">src/assets/images/talleres/</w:t>
+      </w:r>
+      <w:r>
+        <w:t xml:space="preserve"> (taller1 a taller5) — fotos de cada taller. Se conectan mediante el campo </w:t>
+      </w:r>
+      <w:r>
+        <w:rPr>
+          <w:rFonts w:ascii="Consolas" w:cs="Consolas" w:eastAsia="Consolas" w:hAnsi="Consolas"/>
+          <w:color w:val="1F4E79"/>
+        </w:rPr>
+        <w:t xml:space="preserve">imagen</w:t>
+      </w:r>
+      <w:r>
+        <w:t xml:space="preserve"> de </w:t>
+      </w:r>
+      <w:r>
+        <w:rPr>
+          <w:rFonts w:ascii="Consolas" w:cs="Consolas" w:eastAsia="Consolas" w:hAnsi="Consolas"/>
+          <w:color w:val="1F4E79"/>
+        </w:rPr>
+        <w:t xml:space="preserve">data/talleres.js</w:t>
+      </w:r>
+      <w:r>
+        <w:t xml:space="preserve"> y se muestran en </w:t>
+      </w:r>
+      <w:r>
+        <w:rPr>
+          <w:rFonts w:ascii="Consolas" w:cs="Consolas" w:eastAsia="Consolas" w:hAnsi="Consolas"/>
+          <w:color w:val="1F4E79"/>
+        </w:rPr>
+        <w:t xml:space="preserve">TallerCard.jsx</w:t>
+      </w:r>
+      <w:r>
+        <w:t xml:space="preserve">.</w:t>
+      </w:r>
+    </w:p>
+    <w:p>
+      <w:pPr>
+        <w:pStyle w:val="ListParagraph"/>
+        <w:numPr>
+          <w:ilvl w:val="0"/>
+          <w:numId w:val="2"/>
+        </w:numPr>
+        <w:spacing w:after="60"/>
+      </w:pPr>
+      <w:r>
+        <w:rPr>
+          <w:rFonts w:ascii="Consolas" w:cs="Consolas" w:eastAsia="Consolas" w:hAnsi="Consolas"/>
+          <w:color w:val="1F4E79"/>
+        </w:rPr>
+        <w:t xml:space="preserve">src/assets/images/agenda.jpg</w:t>
+      </w:r>
+      <w:r>
+        <w:t xml:space="preserve"> — imagen de la sección Ventajas de Eventos (</w:t>
+      </w:r>
+      <w:r>
+        <w:rPr>
+          <w:rFonts w:ascii="Consolas" w:cs="Consolas" w:eastAsia="Consolas" w:hAnsi="Consolas"/>
+          <w:color w:val="1F4E79"/>
+        </w:rPr>
+        <w:t xml:space="preserve">eventos/Ventajas.jsx</w:t>
+      </w:r>
+      <w:r>
+        <w:t xml:space="preserve">). Se corrigió la ruta del import (</w:t>
+      </w:r>
+      <w:r>
+        <w:rPr>
+          <w:rFonts w:ascii="Consolas" w:cs="Consolas" w:eastAsia="Consolas" w:hAnsi="Consolas"/>
+          <w:color w:val="1F4E79"/>
+        </w:rPr>
+        <w:t xml:space="preserve">../../assets/...</w:t>
+      </w:r>
+      <w:r>
+        <w:t xml:space="preserve"> en lugar de </w:t>
+      </w:r>
+      <w:r>
+        <w:rPr>
+          <w:rFonts w:ascii="Consolas" w:cs="Consolas" w:eastAsia="Consolas" w:hAnsi="Consolas"/>
+          <w:color w:val="1F4E79"/>
+        </w:rPr>
+        <w:t xml:space="preserve">../assets/...</w:t>
+      </w:r>
+      <w:r>
+        <w:t xml:space="preserve">).</w:t>
+      </w:r>
+    </w:p>
+    <w:p>
+      <w:pPr>
+        <w:pStyle w:val="Heading2"/>
+        <w:spacing w:after="120" w:before="280"/>
+      </w:pPr>
+      <w:r>
+        <w:rPr>
+          <w:b/>
+          <w:bCs/>
+        </w:rPr>
+        <w:t xml:space="preserve">17. Nuevo diseño del footer</w:t>
+      </w:r>
+    </w:p>
+    <w:p>
+      <w:pPr>
+        <w:pStyle w:val="ListParagraph"/>
+        <w:numPr>
+          <w:ilvl w:val="0"/>
+          <w:numId w:val="2"/>
+        </w:numPr>
+        <w:spacing w:after="60"/>
+      </w:pPr>
+      <w:r>
+        <w:rPr>
+          <w:rFonts w:ascii="Consolas" w:cs="Consolas" w:eastAsia="Consolas" w:hAnsi="Consolas"/>
+          <w:color w:val="1F4E79"/>
+        </w:rPr>
+        <w:t xml:space="preserve">src/components/layout/Footer.jsx</w:t>
+      </w:r>
+      <w:r>
+        <w:t xml:space="preserve"> — rediseñado con una segunda referencia: tagline "Primero entendemos. Después diseñamos.", botón "Conversemos", columnas Unidades (Agency, Lab, Academy, Network, Eventos), Ecosistema y Hablemos, y barra inferior "Hagamos que suceda".</w:t>
+      </w:r>
+    </w:p>
+    <w:p>
+      <w:pPr>
+        <w:pStyle w:val="ListParagraph"/>
+        <w:numPr>
+          <w:ilvl w:val="0"/>
+          <w:numId w:val="2"/>
+        </w:numPr>
+        <w:spacing w:after="60"/>
+      </w:pPr>
+      <w:r>
+        <w:t xml:space="preserve">Ajustes de detalle: el logo se alineó con el tagline, la marca de agua "BEAKEN" se apoyó sobre la línea divisoria y, en anchos medios (640 a 1024 px), las tres columnas de enlaces quedan en una fila debajo del logo.</w:t>
+      </w:r>
+    </w:p>
+    <w:p>
+      <w:pPr>
+        <w:pStyle w:val="Heading2"/>
+        <w:spacing w:after="120" w:before="280"/>
+      </w:pPr>
+      <w:r>
+        <w:rPr>
+          <w:b/>
+          <w:bCs/>
+        </w:rPr>
+        <w:t xml:space="preserve">18. Sección Inscripción</w:t>
+      </w:r>
+    </w:p>
+    <w:p>
+      <w:pPr>
+        <w:pStyle w:val="ListParagraph"/>
+        <w:numPr>
+          <w:ilvl w:val="0"/>
+          <w:numId w:val="2"/>
+        </w:numPr>
+        <w:spacing w:after="60"/>
+      </w:pPr>
+      <w:r>
+        <w:rPr>
+          <w:rFonts w:ascii="Consolas" w:cs="Consolas" w:eastAsia="Consolas" w:hAnsi="Consolas"/>
+          <w:color w:val="1F4E79"/>
+        </w:rPr>
+        <w:t xml:space="preserve">src/components/inscripcion/</w:t>
+      </w:r>
+      <w:r>
+        <w:t xml:space="preserve">: </w:t>
+      </w:r>
+      <w:r>
+        <w:rPr>
+          <w:rFonts w:ascii="Consolas" w:cs="Consolas" w:eastAsia="Consolas" w:hAnsi="Consolas"/>
+          <w:color w:val="1F4E79"/>
+        </w:rPr>
+        <w:t xml:space="preserve">Hero.jsx</w:t>
+      </w:r>
+      <w:r>
+        <w:t xml:space="preserve">, </w:t>
+      </w:r>
+      <w:r>
+        <w:rPr>
+          <w:rFonts w:ascii="Consolas" w:cs="Consolas" w:eastAsia="Consolas" w:hAnsi="Consolas"/>
+          <w:color w:val="1F4E79"/>
+        </w:rPr>
+        <w:t xml:space="preserve">FormularioInscripcion.jsx</w:t>
+      </w:r>
+      <w:r>
+        <w:t xml:space="preserve"> (campos, selector de curso, taller o evento, términos y confirmación de envío), </w:t>
+      </w:r>
+      <w:r>
+        <w:rPr>
+          <w:rFonts w:ascii="Consolas" w:cs="Consolas" w:eastAsia="Consolas" w:hAnsi="Consolas"/>
+          <w:color w:val="1F4E79"/>
+        </w:rPr>
+        <w:t xml:space="preserve">FormularioEmpresa.jsx</w:t>
+      </w:r>
+      <w:r>
+        <w:t xml:space="preserve"> y </w:t>
+      </w:r>
+      <w:r>
+        <w:rPr>
+          <w:rFonts w:ascii="Consolas" w:cs="Consolas" w:eastAsia="Consolas" w:hAnsi="Consolas"/>
+          <w:color w:val="1F4E79"/>
+        </w:rPr>
+        <w:t xml:space="preserve">PreguntasFrecuentes.jsx</w:t>
+      </w:r>
+      <w:r>
+        <w:t xml:space="preserve"> (acordeón).</w:t>
+      </w:r>
+    </w:p>
+    <w:p>
+      <w:pPr>
+        <w:pStyle w:val="ListParagraph"/>
+        <w:numPr>
+          <w:ilvl w:val="0"/>
+          <w:numId w:val="2"/>
+        </w:numPr>
+        <w:spacing w:after="60"/>
+      </w:pPr>
+      <w:r>
+        <w:rPr>
+          <w:rFonts w:ascii="Consolas" w:cs="Consolas" w:eastAsia="Consolas" w:hAnsi="Consolas"/>
+          <w:color w:val="1F4E79"/>
+        </w:rPr>
+        <w:t xml:space="preserve">src/pages/InscripcionPage.jsx</w:t>
+      </w:r>
+      <w:r>
+        <w:t xml:space="preserve">, ruta </w:t>
+      </w:r>
+      <w:r>
+        <w:rPr>
+          <w:rFonts w:ascii="Consolas" w:cs="Consolas" w:eastAsia="Consolas" w:hAnsi="Consolas"/>
+          <w:color w:val="1F4E79"/>
+        </w:rPr>
+        <w:t xml:space="preserve">/registro</w:t>
+      </w:r>
+      <w:r>
+        <w:t xml:space="preserve"> en </w:t>
+      </w:r>
+      <w:r>
+        <w:rPr>
+          <w:rFonts w:ascii="Consolas" w:cs="Consolas" w:eastAsia="Consolas" w:hAnsi="Consolas"/>
+          <w:color w:val="1F4E79"/>
+        </w:rPr>
+        <w:t xml:space="preserve">App.jsx</w:t>
+      </w:r>
+      <w:r>
+        <w:t xml:space="preserve">; el botón "Registro" del Navbar pasó a ser un enlace de React Router.</w:t>
+      </w:r>
+    </w:p>
+    <w:p>
+      <w:pPr>
+        <w:pStyle w:val="ListParagraph"/>
+        <w:numPr>
+          <w:ilvl w:val="0"/>
+          <w:numId w:val="2"/>
+        </w:numPr>
+        <w:spacing w:after="60"/>
+      </w:pPr>
+      <w:r>
+        <w:t xml:space="preserve">Los formularios validan los campos obligatorios, pero todavía no guardan datos: hasta conectar el backend, el envío solo muestra un mensaje de confirmación.</w:t>
+      </w:r>
+    </w:p>
+    <w:p>
+      <w:pPr>
+        <w:pStyle w:val="ListParagraph"/>
+        <w:numPr>
+          <w:ilvl w:val="0"/>
+          <w:numId w:val="2"/>
+        </w:numPr>
+        <w:spacing w:after="60"/>
+      </w:pPr>
+      <w:r>
+        <w:t xml:space="preserve">Del boceto se omitió el bloque de opciones genéricas ("First choice… Other"), por no tener un significado definido.</w:t>
+      </w:r>
+    </w:p>
+    <w:p>
+      <w:pPr>
+        <w:pStyle w:val="Heading2"/>
+        <w:spacing w:after="120" w:before="280"/>
+      </w:pPr>
+      <w:r>
+        <w:rPr>
+          <w:b/>
+          <w:bCs/>
+        </w:rPr>
+        <w:t xml:space="preserve">19. Color de fondo propio y ajustes en Inscripción</w:t>
+      </w:r>
+    </w:p>
+    <w:p>
+      <w:pPr>
+        <w:pStyle w:val="ListParagraph"/>
+        <w:numPr>
+          <w:ilvl w:val="0"/>
+          <w:numId w:val="2"/>
+        </w:numPr>
+        <w:spacing w:after="60"/>
+      </w:pPr>
+      <w:r>
+        <w:rPr>
+          <w:rFonts w:ascii="Consolas" w:cs="Consolas" w:eastAsia="Consolas" w:hAnsi="Consolas"/>
+          <w:color w:val="1F4E79"/>
+        </w:rPr>
+        <w:t xml:space="preserve">src/index.css</w:t>
+      </w:r>
+      <w:r>
+        <w:t xml:space="preserve"> — en el bloque </w:t>
+      </w:r>
+      <w:r>
+        <w:rPr>
+          <w:rFonts w:ascii="Consolas" w:cs="Consolas" w:eastAsia="Consolas" w:hAnsi="Consolas"/>
+          <w:color w:val="1F4E79"/>
+        </w:rPr>
+        <w:t xml:space="preserve">@theme</w:t>
+      </w:r>
+      <w:r>
+        <w:t xml:space="preserve"> se definieron dos colores propios: </w:t>
+      </w:r>
+      <w:r>
+        <w:rPr>
+          <w:rFonts w:ascii="Consolas" w:cs="Consolas" w:eastAsia="Consolas" w:hAnsi="Consolas"/>
+          <w:color w:val="1F4E79"/>
+        </w:rPr>
+        <w:t xml:space="preserve">--color-fondo-claro-secciones</w:t>
+      </w:r>
+      <w:r>
+        <w:t xml:space="preserve"> (rgb 245, 246, 248) y </w:t>
+      </w:r>
+      <w:r>
+        <w:rPr>
+          <w:rFonts w:ascii="Consolas" w:cs="Consolas" w:eastAsia="Consolas" w:hAnsi="Consolas"/>
+          <w:color w:val="1F4E79"/>
+        </w:rPr>
+        <w:t xml:space="preserve">--color-fondo-oscuro-secciones</w:t>
+      </w:r>
+      <w:r>
+        <w:t xml:space="preserve"> (rgb 16, 41, 64, el azul marino del footer, aún sin usar en componentes).</w:t>
+      </w:r>
+    </w:p>
+    <w:p>
+      <w:pPr>
+        <w:pStyle w:val="ListParagraph"/>
+        <w:numPr>
+          <w:ilvl w:val="0"/>
+          <w:numId w:val="2"/>
+        </w:numPr>
+        <w:spacing w:after="60"/>
+      </w:pPr>
+      <w:r>
+        <w:rPr>
+          <w:rFonts w:ascii="Consolas" w:cs="Consolas" w:eastAsia="Consolas" w:hAnsi="Consolas"/>
+          <w:color w:val="1F4E79"/>
+        </w:rPr>
+        <w:t xml:space="preserve">CursosPage.jsx</w:t>
+      </w:r>
+      <w:r>
+        <w:t xml:space="preserve">, </w:t>
+      </w:r>
+      <w:r>
+        <w:rPr>
+          <w:rFonts w:ascii="Consolas" w:cs="Consolas" w:eastAsia="Consolas" w:hAnsi="Consolas"/>
+          <w:color w:val="1F4E79"/>
+        </w:rPr>
+        <w:t xml:space="preserve">TalleresPage.jsx</w:t>
+      </w:r>
+      <w:r>
+        <w:t xml:space="preserve">, </w:t>
+      </w:r>
+      <w:r>
+        <w:rPr>
+          <w:rFonts w:ascii="Consolas" w:cs="Consolas" w:eastAsia="Consolas" w:hAnsi="Consolas"/>
+          <w:color w:val="1F4E79"/>
+        </w:rPr>
+        <w:t xml:space="preserve">EventosPage.jsx</w:t>
+      </w:r>
+      <w:r>
+        <w:t xml:space="preserve"> e </w:t>
+      </w:r>
+      <w:r>
+        <w:rPr>
+          <w:rFonts w:ascii="Consolas" w:cs="Consolas" w:eastAsia="Consolas" w:hAnsi="Consolas"/>
+          <w:color w:val="1F4E79"/>
+        </w:rPr>
+        <w:t xml:space="preserve">InscripcionPage.jsx</w:t>
+      </w:r>
+      <w:r>
+        <w:t xml:space="preserve"> — las clases </w:t>
+      </w:r>
+      <w:r>
+        <w:rPr>
+          <w:rFonts w:ascii="Consolas" w:cs="Consolas" w:eastAsia="Consolas" w:hAnsi="Consolas"/>
+          <w:color w:val="1F4E79"/>
+        </w:rPr>
+        <w:t xml:space="preserve">tw:bg-indigo-50</w:t>
+      </w:r>
+      <w:r>
+        <w:t xml:space="preserve"> y </w:t>
+      </w:r>
+      <w:r>
+        <w:rPr>
+          <w:rFonts w:ascii="Consolas" w:cs="Consolas" w:eastAsia="Consolas" w:hAnsi="Consolas"/>
+          <w:color w:val="1F4E79"/>
+        </w:rPr>
+        <w:t xml:space="preserve">tw:bg-blue-50</w:t>
+      </w:r>
+      <w:r>
+        <w:t xml:space="preserve"> se reemplazaron por </w:t>
+      </w:r>
+      <w:r>
+        <w:rPr>
+          <w:rFonts w:ascii="Consolas" w:cs="Consolas" w:eastAsia="Consolas" w:hAnsi="Consolas"/>
+          <w:color w:val="1F4E79"/>
+        </w:rPr>
+        <w:t xml:space="preserve">tw:bg-fondo-claro-secciones</w:t>
+      </w:r>
+      <w:r>
+        <w:t xml:space="preserve">, de modo que todas las páginas usan el mismo tono. En Eventos e Inscripción se quitó el fondo de Contacto y de las preguntas frecuentes.</w:t>
+      </w:r>
+    </w:p>
+    <w:p>
+      <w:pPr>
+        <w:pStyle w:val="ListParagraph"/>
+        <w:numPr>
+          <w:ilvl w:val="0"/>
+          <w:numId w:val="2"/>
+        </w:numPr>
+        <w:spacing w:after="60"/>
+      </w:pPr>
+      <w:r>
+        <w:rPr>
+          <w:rFonts w:ascii="Consolas" w:cs="Consolas" w:eastAsia="Consolas" w:hAnsi="Consolas"/>
+          <w:color w:val="1F4E79"/>
+        </w:rPr>
+        <w:t xml:space="preserve">src/assets/images/heroInscripcion.jpg</w:t>
+      </w:r>
+      <w:r>
+        <w:t xml:space="preserve"> — conectada como fondo en </w:t>
+      </w:r>
+      <w:r>
+        <w:rPr>
+          <w:rFonts w:ascii="Consolas" w:cs="Consolas" w:eastAsia="Consolas" w:hAnsi="Consolas"/>
+          <w:color w:val="1F4E79"/>
+        </w:rPr>
+        <w:t xml:space="preserve">inscripcion/Hero.jsx</w:t>
+      </w:r>
+      <w:r>
+        <w:t xml:space="preserve"> (con el overlay oscuro); también se agregó </w:t>
+      </w:r>
+      <w:r>
+        <w:rPr>
+          <w:rFonts w:ascii="Consolas" w:cs="Consolas" w:eastAsia="Consolas" w:hAnsi="Consolas"/>
+          <w:color w:val="1F4E79"/>
+        </w:rPr>
+        <w:t xml:space="preserve">heroInscripcion2.jpg</w:t>
+      </w:r>
+      <w:r>
+        <w:t xml:space="preserve"> como alternativa.</w:t>
+      </w:r>
+    </w:p>
+    <w:p>
+      <w:pPr>
+        <w:pStyle w:val="ListParagraph"/>
+        <w:numPr>
+          <w:ilvl w:val="0"/>
+          <w:numId w:val="2"/>
+        </w:numPr>
+        <w:spacing w:after="60"/>
+      </w:pPr>
+      <w:r>
+        <w:rPr>
+          <w:rFonts w:ascii="Consolas" w:cs="Consolas" w:eastAsia="Consolas" w:hAnsi="Consolas"/>
+          <w:color w:val="1F4E79"/>
+        </w:rPr>
+        <w:t xml:space="preserve">inscripcion/PreguntasFrecuentes.jsx</w:t>
+      </w:r>
+      <w:r>
+        <w:t xml:space="preserve"> — se quitó la pregunta "¿Hay certificado?"; el acordeón quedó con 4 preguntas.</w:t>
+      </w:r>
+    </w:p>
+    <w:p>
+      <w:pPr>
+        <w:pStyle w:val="Heading2"/>
+        <w:spacing w:after="120" w:before="280"/>
+      </w:pPr>
+      <w:r>
+        <w:rPr>
+          <w:b/>
+          <w:bCs/>
+        </w:rPr>
+        <w:t xml:space="preserve">20. Estado actual y pendientes</w:t>
+      </w:r>
+    </w:p>
+    <w:p>
+      <w:pPr>
+        <w:pStyle w:val="ListParagraph"/>
+        <w:numPr>
+          <w:ilvl w:val="0"/>
+          <w:numId w:val="2"/>
+        </w:numPr>
+        <w:spacing w:after="60"/>
+      </w:pPr>
+      <w:r>
+        <w:t xml:space="preserve">Historial de commits en GitHub: "Primera version del frontend: seccion de Cursos", "Cambios en hero, footer y arquitectura", "Borrador de Talleres", "Borrador de Eventos" y "Actualizacion del footer".</w:t>
+      </w:r>
+    </w:p>
+    <w:p>
+      <w:pPr>
+        <w:pStyle w:val="ListParagraph"/>
+        <w:numPr>
+          <w:ilvl w:val="0"/>
+          <w:numId w:val="2"/>
+        </w:numPr>
+        <w:spacing w:after="60"/>
+      </w:pPr>
+      <w:r>
+        <w:t xml:space="preserve">Sin subir aún: la página de Inscripción (carpeta </w:t>
+      </w:r>
+      <w:r>
+        <w:rPr>
+          <w:rFonts w:ascii="Consolas" w:cs="Consolas" w:eastAsia="Consolas" w:hAnsi="Consolas"/>
+          <w:color w:val="1F4E79"/>
+        </w:rPr>
+        <w:t xml:space="preserve">components/inscripcion/</w:t>
+      </w:r>
+      <w:r>
+        <w:t xml:space="preserve">, </w:t>
+      </w:r>
+      <w:r>
+        <w:rPr>
+          <w:rFonts w:ascii="Consolas" w:cs="Consolas" w:eastAsia="Consolas" w:hAnsi="Consolas"/>
+          <w:color w:val="1F4E79"/>
+        </w:rPr>
+        <w:t xml:space="preserve">InscripcionPage.jsx</w:t>
+      </w:r>
+      <w:r>
+        <w:t xml:space="preserve"> e imágenes heroInscripcion), el color de fondo propio (</w:t>
+      </w:r>
+      <w:r>
+        <w:rPr>
+          <w:rFonts w:ascii="Consolas" w:cs="Consolas" w:eastAsia="Consolas" w:hAnsi="Consolas"/>
+          <w:color w:val="1F4E79"/>
+        </w:rPr>
+        <w:t xml:space="preserve">index.css</w:t>
+      </w:r>
+      <w:r>
+        <w:t xml:space="preserve"> y las cuatro páginas) y los cambios en </w:t>
+      </w:r>
+      <w:r>
+        <w:rPr>
+          <w:rFonts w:ascii="Consolas" w:cs="Consolas" w:eastAsia="Consolas" w:hAnsi="Consolas"/>
+          <w:color w:val="1F4E79"/>
+        </w:rPr>
+        <w:t xml:space="preserve">App.jsx</w:t>
+      </w:r>
+      <w:r>
+        <w:t xml:space="preserve"> y </w:t>
+      </w:r>
+      <w:r>
+        <w:rPr>
+          <w:rFonts w:ascii="Consolas" w:cs="Consolas" w:eastAsia="Consolas" w:hAnsi="Consolas"/>
+          <w:color w:val="1F4E79"/>
+        </w:rPr>
+        <w:t xml:space="preserve">Navbar.jsx</w:t>
+      </w:r>
+      <w:r>
+        <w:t xml:space="preserve">.</w:t>
+      </w:r>
+    </w:p>
+    <w:p>
+      <w:pPr>
+        <w:pStyle w:val="ListParagraph"/>
+        <w:numPr>
+          <w:ilvl w:val="0"/>
+          <w:numId w:val="2"/>
+        </w:numPr>
+        <w:spacing w:after="60"/>
+      </w:pPr>
+      <w:r>
+        <w:t xml:space="preserve">Pendiente: optimizar el peso de las imágenes (</w:t>
       </w:r>
       <w:r>
         <w:rPr>
@@ -1769,6 +2333,16 @@
         <w:t xml:space="preserve">heroTalleres.jpg</w:t>
       </w:r>
       <w:r>
+        <w:t xml:space="preserve">, </w:t>
+      </w:r>
+      <w:r>
+        <w:rPr>
+          <w:rFonts w:ascii="Consolas" w:cs="Consolas" w:eastAsia="Consolas" w:hAnsi="Consolas"/>
+          <w:color w:val="1F4E79"/>
+        </w:rPr>
+        <w:t xml:space="preserve">heroEventos.jpg</w:t>
+      </w:r>
+      <w:r>
         <w:t xml:space="preserve"> y </w:t>
       </w:r>
       <w:r>
@@ -1776,23 +2350,36 @@
           <w:rFonts w:ascii="Consolas" w:cs="Consolas" w:eastAsia="Consolas" w:hAnsi="Consolas"/>
           <w:color w:val="1F4E79"/>
         </w:rPr>
-        <w:t xml:space="preserve">heroEventos.jpg</w:t>
-      </w:r>
-      <w:r>
-        <w:t xml:space="preserve"> (2.8 a 3.7 MB).</w:t>
-      </w:r>
-    </w:p>
-    <w:p>
-      <w:pPr>
-        <w:pStyle w:val="ListParagraph"/>
-        <w:numPr>
-          <w:ilvl w:val="0"/>
-          <w:numId w:val="2"/>
-        </w:numPr>
-        <w:spacing w:after="60"/>
-      </w:pPr>
-      <w:r>
-        <w:t xml:space="preserve">Pendiente: páginas de Inscripción, login y Mis cursos, y la conexión con la base de datos (fase de backend).</w:t>
+        <w:t xml:space="preserve">agenda.jpg</w:t>
+      </w:r>
+      <w:r>
+        <w:t xml:space="preserve">, de 2.8 a 4 MB).</w:t>
+      </w:r>
+    </w:p>
+    <w:p>
+      <w:pPr>
+        <w:pStyle w:val="ListParagraph"/>
+        <w:numPr>
+          <w:ilvl w:val="0"/>
+          <w:numId w:val="2"/>
+        </w:numPr>
+        <w:spacing w:after="60"/>
+      </w:pPr>
+      <w:r>
+        <w:t xml:space="preserve">Pendiente: decidir si se entregan certificados (el esquema de la base de datos eliminó esa tabla; ya se quitó la pregunta de las preguntas frecuentes, pero Ventajas aún menciona la certificación).</w:t>
+      </w:r>
+    </w:p>
+    <w:p>
+      <w:pPr>
+        <w:pStyle w:val="ListParagraph"/>
+        <w:numPr>
+          <w:ilvl w:val="0"/>
+          <w:numId w:val="2"/>
+        </w:numPr>
+        <w:spacing w:after="60"/>
+      </w:pPr>
+      <w:r>
+        <w:t xml:space="preserve">Siguientes pasos: página Networking, login, Mis cursos, pasada de pulido (menú móvil, títulos de pestaña, animaciones) y la conexión con la base de datos (fase de backend).</w:t>
       </w:r>
     </w:p>
     <w:sectPr>

</xml_diff>

<commit_message>
Botones de reinscripcion se redirigen a pagina de registro
</commit_message>
<xml_diff>
--- a/frontend/Orden-de-creacion-frontend.docx
+++ b/frontend/Orden-de-creacion-frontend.docx
@@ -2234,40 +2234,394 @@
           <w:b/>
           <w:bCs/>
         </w:rPr>
-        <w:t xml:space="preserve">20. Estado actual y pendientes</w:t>
-      </w:r>
-    </w:p>
-    <w:p>
-      <w:pPr>
-        <w:pStyle w:val="ListParagraph"/>
-        <w:numPr>
-          <w:ilvl w:val="0"/>
-          <w:numId w:val="2"/>
-        </w:numPr>
-        <w:spacing w:after="60"/>
-      </w:pPr>
-      <w:r>
-        <w:t xml:space="preserve">Historial de commits en GitHub: "Primera version del frontend: seccion de Cursos", "Cambios en hero, footer y arquitectura", "Borrador de Talleres", "Borrador de Eventos" y "Actualizacion del footer".</w:t>
-      </w:r>
-    </w:p>
-    <w:p>
-      <w:pPr>
-        <w:pStyle w:val="ListParagraph"/>
-        <w:numPr>
-          <w:ilvl w:val="0"/>
-          <w:numId w:val="2"/>
-        </w:numPr>
-        <w:spacing w:after="60"/>
-      </w:pPr>
-      <w:r>
-        <w:t xml:space="preserve">Sin subir aún: la página de Inscripción (carpeta </w:t>
-      </w:r>
-      <w:r>
-        <w:rPr>
-          <w:rFonts w:ascii="Consolas" w:cs="Consolas" w:eastAsia="Consolas" w:hAnsi="Consolas"/>
-          <w:color w:val="1F4E79"/>
-        </w:rPr>
-        <w:t xml:space="preserve">components/inscripcion/</w:t>
+        <w:t xml:space="preserve">20. Segundo rediseño del footer</w:t>
+      </w:r>
+    </w:p>
+    <w:p>
+      <w:pPr>
+        <w:pStyle w:val="ListParagraph"/>
+        <w:numPr>
+          <w:ilvl w:val="0"/>
+          <w:numId w:val="2"/>
+        </w:numPr>
+        <w:spacing w:after="60"/>
+      </w:pPr>
+      <w:r>
+        <w:rPr>
+          <w:rFonts w:ascii="Consolas" w:cs="Consolas" w:eastAsia="Consolas" w:hAnsi="Consolas"/>
+          <w:color w:val="1F4E79"/>
+        </w:rPr>
+        <w:t xml:space="preserve">src/components/layout/Footer.jsx</w:t>
+      </w:r>
+      <w:r>
+        <w:t xml:space="preserve"> — se reemplazó por una segunda referencia visual: tagline "Primero entendemos. Después diseñamos.", botón "Conversemos", columnas Unidades (Agency, Lab, Academy, Network, Eventos), Ecosistema (Comunidad, Plataforma de clientes, Colabora con Beaken, Administración) y Hablemos (correo, teléfono grande, ubicación, Aviso de privacidad, Derechos ARCO), y barra inferior "© 2026 Beaken" / "Hagamos que suceda".</w:t>
+      </w:r>
+    </w:p>
+    <w:p>
+      <w:pPr>
+        <w:pStyle w:val="ListParagraph"/>
+        <w:numPr>
+          <w:ilvl w:val="0"/>
+          <w:numId w:val="2"/>
+        </w:numPr>
+        <w:spacing w:after="60"/>
+      </w:pPr>
+      <w:r>
+        <w:t xml:space="preserve">Ajustes de detalle a partir de capturas del inspector del navegador: el logo se alineó recortando su margen interno transparente, la marca de agua "BEAKEN" se apoyó sobre la línea divisoria, y en anchos medios (640 a 1024 px) las columnas de enlaces pasan a una sola fila debajo del logo.</w:t>
+      </w:r>
+    </w:p>
+    <w:p>
+      <w:pPr>
+        <w:pStyle w:val="Heading2"/>
+        <w:spacing w:after="120" w:before="280"/>
+      </w:pPr>
+      <w:r>
+        <w:rPr>
+          <w:b/>
+          <w:bCs/>
+        </w:rPr>
+        <w:t xml:space="preserve">21. Estilo de títulos de sección "punto rosa"</w:t>
+      </w:r>
+    </w:p>
+    <w:p>
+      <w:pPr>
+        <w:pStyle w:val="ListParagraph"/>
+        <w:numPr>
+          <w:ilvl w:val="0"/>
+          <w:numId w:val="2"/>
+        </w:numPr>
+        <w:spacing w:after="60"/>
+      </w:pPr>
+      <w:r>
+        <w:t xml:space="preserve">A partir de una captura del inspector de un sitio de referencia (h2 a 52px, fuente "Onest", color #102940), se creó una variante nueva del componente </w:t>
+      </w:r>
+      <w:r>
+        <w:rPr>
+          <w:rFonts w:ascii="Consolas" w:cs="Consolas" w:eastAsia="Consolas" w:hAnsi="Consolas"/>
+          <w:color w:val="1F4E79"/>
+        </w:rPr>
+        <w:t xml:space="preserve">SectionHeading.jsx</w:t>
+      </w:r>
+      <w:r>
+        <w:t xml:space="preserve">: punto rosa en vez de línea azul, etiqueta en gris azulado (ya no monoespaciada), y título en la fuente "Onest", 52px en escritorio, color navy.</w:t>
+      </w:r>
+    </w:p>
+    <w:p>
+      <w:pPr>
+        <w:pStyle w:val="ListParagraph"/>
+        <w:numPr>
+          <w:ilvl w:val="0"/>
+          <w:numId w:val="2"/>
+        </w:numPr>
+        <w:spacing w:after="60"/>
+      </w:pPr>
+      <w:r>
+        <w:rPr>
+          <w:rFonts w:ascii="Consolas" w:cs="Consolas" w:eastAsia="Consolas" w:hAnsi="Consolas"/>
+          <w:color w:val="1F4E79"/>
+        </w:rPr>
+        <w:t xml:space="preserve">index.html</w:t>
+      </w:r>
+      <w:r>
+        <w:t xml:space="preserve"> — se cargó la fuente "Onest" (pesos 600, 700 y 800) desde Google Fonts; </w:t>
+      </w:r>
+      <w:r>
+        <w:rPr>
+          <w:rFonts w:ascii="Consolas" w:cs="Consolas" w:eastAsia="Consolas" w:hAnsi="Consolas"/>
+          <w:color w:val="1F4E79"/>
+        </w:rPr>
+        <w:t xml:space="preserve">index.css</w:t>
+      </w:r>
+      <w:r>
+        <w:t xml:space="preserve"> — se agregó el token </w:t>
+      </w:r>
+      <w:r>
+        <w:rPr>
+          <w:rFonts w:ascii="Consolas" w:cs="Consolas" w:eastAsia="Consolas" w:hAnsi="Consolas"/>
+          <w:color w:val="1F4E79"/>
+        </w:rPr>
+        <w:t xml:space="preserve">--font-display</w:t>
+      </w:r>
+      <w:r>
+        <w:t xml:space="preserve"> con esa fuente.</w:t>
+      </w:r>
+    </w:p>
+    <w:p>
+      <w:pPr>
+        <w:pStyle w:val="ListParagraph"/>
+        <w:numPr>
+          <w:ilvl w:val="0"/>
+          <w:numId w:val="2"/>
+        </w:numPr>
+        <w:spacing w:after="60"/>
+      </w:pPr>
+      <w:r>
+        <w:t xml:space="preserve">Se aplicó primero solo en Talleres, usando una prop </w:t>
+      </w:r>
+      <w:r>
+        <w:rPr>
+          <w:rFonts w:ascii="Consolas" w:cs="Consolas" w:eastAsia="Consolas" w:hAnsi="Consolas"/>
+          <w:color w:val="1F4E79"/>
+        </w:rPr>
+        <w:t xml:space="preserve">variant</w:t>
+      </w:r>
+      <w:r>
+        <w:t xml:space="preserve"> en </w:t>
+      </w:r>
+      <w:r>
+        <w:rPr>
+          <w:rFonts w:ascii="Consolas" w:cs="Consolas" w:eastAsia="Consolas" w:hAnsi="Consolas"/>
+          <w:color w:val="1F4E79"/>
+        </w:rPr>
+        <w:t xml:space="preserve">SectionHeading</w:t>
+      </w:r>
+      <w:r>
+        <w:t xml:space="preserve"> (por defecto el estilo anterior, con línea) para no afectar las demás páginas; </w:t>
+      </w:r>
+      <w:r>
+        <w:rPr>
+          <w:rFonts w:ascii="Consolas" w:cs="Consolas" w:eastAsia="Consolas" w:hAnsi="Consolas"/>
+          <w:color w:val="1F4E79"/>
+        </w:rPr>
+        <w:t xml:space="preserve">Proceso.jsx</w:t>
+      </w:r>
+      <w:r>
+        <w:t xml:space="preserve"> y </w:t>
+      </w:r>
+      <w:r>
+        <w:rPr>
+          <w:rFonts w:ascii="Consolas" w:cs="Consolas" w:eastAsia="Consolas" w:hAnsi="Consolas"/>
+          <w:color w:val="1F4E79"/>
+        </w:rPr>
+        <w:t xml:space="preserve">Contacto.jsx</w:t>
+      </w:r>
+      <w:r>
+        <w:t xml:space="preserve">, al ser compartidos, también recibieron esa prop para poder activarla solo desde </w:t>
+      </w:r>
+      <w:r>
+        <w:rPr>
+          <w:rFonts w:ascii="Consolas" w:cs="Consolas" w:eastAsia="Consolas" w:hAnsi="Consolas"/>
+          <w:color w:val="1F4E79"/>
+        </w:rPr>
+        <w:t xml:space="preserve">TalleresPage.jsx</w:t>
+      </w:r>
+      <w:r>
+        <w:t xml:space="preserve">.</w:t>
+      </w:r>
+    </w:p>
+    <w:p>
+      <w:pPr>
+        <w:pStyle w:val="ListParagraph"/>
+        <w:numPr>
+          <w:ilvl w:val="0"/>
+          <w:numId w:val="2"/>
+        </w:numPr>
+        <w:spacing w:after="60"/>
+      </w:pPr>
+      <w:r>
+        <w:t xml:space="preserve">Después se pidió aplicarlo en el resto del sitio: en lugar de repetirlo página por página, se cambió el valor por defecto de </w:t>
+      </w:r>
+      <w:r>
+        <w:rPr>
+          <w:rFonts w:ascii="Consolas" w:cs="Consolas" w:eastAsia="Consolas" w:hAnsi="Consolas"/>
+          <w:color w:val="1F4E79"/>
+        </w:rPr>
+        <w:t xml:space="preserve">variant</w:t>
+      </w:r>
+      <w:r>
+        <w:t xml:space="preserve"> a </w:t>
+      </w:r>
+      <w:r>
+        <w:rPr>
+          <w:rFonts w:ascii="Consolas" w:cs="Consolas" w:eastAsia="Consolas" w:hAnsi="Consolas"/>
+          <w:color w:val="1F4E79"/>
+        </w:rPr>
+        <w:t xml:space="preserve">'dot'</w:t>
+      </w:r>
+      <w:r>
+        <w:t xml:space="preserve">, con lo que se propagó automáticamente a Cursos, Eventos e Inscripción sin tocar cada archivo. El estilo anterior (línea azul) se dejó en el código, sin uso, por si se necesita revertir.</w:t>
+      </w:r>
+    </w:p>
+    <w:p>
+      <w:pPr>
+        <w:pStyle w:val="Heading2"/>
+        <w:spacing w:after="120" w:before="280"/>
+      </w:pPr>
+      <w:r>
+        <w:rPr>
+          <w:b/>
+          <w:bCs/>
+        </w:rPr>
+        <w:t xml:space="preserve">22. Ajustes de peso de fuente y el CTA "Tu lugar te espera"</w:t>
+      </w:r>
+    </w:p>
+    <w:p>
+      <w:pPr>
+        <w:pStyle w:val="ListParagraph"/>
+        <w:numPr>
+          <w:ilvl w:val="0"/>
+          <w:numId w:val="2"/>
+        </w:numPr>
+        <w:spacing w:after="60"/>
+      </w:pPr>
+      <w:r>
+        <w:rPr>
+          <w:rFonts w:ascii="Consolas" w:cs="Consolas" w:eastAsia="Consolas" w:hAnsi="Consolas"/>
+          <w:color w:val="1F4E79"/>
+        </w:rPr>
+        <w:t xml:space="preserve">src/components/CtaBanner.jsx</w:t>
+      </w:r>
+      <w:r>
+        <w:t xml:space="preserve"> — el título "Tu lugar te espera" (que no usa SectionHeading, por tener un diseño de dos columnas distinto) se actualizó a mano con la misma tipografía: Onest, 52px, color navy. Se verificó que a ese tamaño cabe en una sola línea dentro de su columna.</w:t>
+      </w:r>
+    </w:p>
+    <w:p>
+      <w:pPr>
+        <w:pStyle w:val="ListParagraph"/>
+        <w:numPr>
+          <w:ilvl w:val="0"/>
+          <w:numId w:val="2"/>
+        </w:numPr>
+        <w:spacing w:after="60"/>
+      </w:pPr>
+      <w:r>
+        <w:t xml:space="preserve">Se agregó la etiqueta "Únete" con el punto rosa arriba de ese título, para que tuviera el mismo patrón que los demás encabezados del sitio.</w:t>
+      </w:r>
+    </w:p>
+    <w:p>
+      <w:pPr>
+        <w:pStyle w:val="ListParagraph"/>
+        <w:numPr>
+          <w:ilvl w:val="0"/>
+          <w:numId w:val="2"/>
+        </w:numPr>
+        <w:spacing w:after="60"/>
+      </w:pPr>
+      <w:r>
+        <w:t xml:space="preserve">El peso de letra de todos los títulos con punto rosa se redujo de </w:t>
+      </w:r>
+      <w:r>
+        <w:rPr>
+          <w:rFonts w:ascii="Consolas" w:cs="Consolas" w:eastAsia="Consolas" w:hAnsi="Consolas"/>
+          <w:color w:val="1F4E79"/>
+        </w:rPr>
+        <w:t xml:space="preserve">font-bold</w:t>
+      </w:r>
+      <w:r>
+        <w:t xml:space="preserve"> (700) a </w:t>
+      </w:r>
+      <w:r>
+        <w:rPr>
+          <w:rFonts w:ascii="Consolas" w:cs="Consolas" w:eastAsia="Consolas" w:hAnsi="Consolas"/>
+          <w:color w:val="1F4E79"/>
+        </w:rPr>
+        <w:t xml:space="preserve">font-semibold</w:t>
+      </w:r>
+      <w:r>
+        <w:t xml:space="preserve"> (600), en </w:t>
+      </w:r>
+      <w:r>
+        <w:rPr>
+          <w:rFonts w:ascii="Consolas" w:cs="Consolas" w:eastAsia="Consolas" w:hAnsi="Consolas"/>
+          <w:color w:val="1F4E79"/>
+        </w:rPr>
+        <w:t xml:space="preserve">SectionHeading.jsx</w:t>
+      </w:r>
+      <w:r>
+        <w:t xml:space="preserve"> y en </w:t>
+      </w:r>
+      <w:r>
+        <w:rPr>
+          <w:rFonts w:ascii="Consolas" w:cs="Consolas" w:eastAsia="Consolas" w:hAnsi="Consolas"/>
+          <w:color w:val="1F4E79"/>
+        </w:rPr>
+        <w:t xml:space="preserve">CtaBanner.jsx</w:t>
+      </w:r>
+      <w:r>
+        <w:t xml:space="preserve">, por pedido de que la letra se viera "más delgada".</w:t>
+      </w:r>
+    </w:p>
+    <w:p>
+      <w:pPr>
+        <w:pStyle w:val="ListParagraph"/>
+        <w:numPr>
+          <w:ilvl w:val="0"/>
+          <w:numId w:val="2"/>
+        </w:numPr>
+        <w:spacing w:after="60"/>
+      </w:pPr>
+      <w:r>
+        <w:rPr>
+          <w:rFonts w:ascii="Consolas" w:cs="Consolas" w:eastAsia="Consolas" w:hAnsi="Consolas"/>
+          <w:color w:val="1F4E79"/>
+        </w:rPr>
+        <w:t xml:space="preserve">src/assets/images/imagen2.jpg</w:t>
+      </w:r>
+      <w:r>
+        <w:t xml:space="preserve"> — foto agregada a "¿Tu empresa se quiere sumar?" (</w:t>
+      </w:r>
+      <w:r>
+        <w:rPr>
+          <w:rFonts w:ascii="Consolas" w:cs="Consolas" w:eastAsia="Consolas" w:hAnsi="Consolas"/>
+          <w:color w:val="1F4E79"/>
+        </w:rPr>
+        <w:t xml:space="preserve">FormularioEmpresa.jsx</w:t>
+      </w:r>
+      <w:r>
+        <w:t xml:space="preserve">); se revisó por un reporte de que se veía de menor calidad que las demás: la implementación estaba correcta (es la imagen de mayor resolución del proyecto), la diferencia percibida es de estilo (foto con luz interior tenue) y no un error técnico.</w:t>
+      </w:r>
+    </w:p>
+    <w:p>
+      <w:pPr>
+        <w:pStyle w:val="Heading2"/>
+        <w:spacing w:after="120" w:before="280"/>
+      </w:pPr>
+      <w:r>
+        <w:rPr>
+          <w:b/>
+          <w:bCs/>
+        </w:rPr>
+        <w:t xml:space="preserve">23. Enlaces "Inscribirme" funcionales</w:t>
+      </w:r>
+    </w:p>
+    <w:p>
+      <w:pPr>
+        <w:pStyle w:val="ListParagraph"/>
+        <w:numPr>
+          <w:ilvl w:val="0"/>
+          <w:numId w:val="2"/>
+        </w:numPr>
+        <w:spacing w:after="60"/>
+      </w:pPr>
+      <w:r>
+        <w:t xml:space="preserve">Se detectó que el botón "Inscribirme" de las tarjetas de Cursos, Talleres y Eventos no hacía nada (un </w:t>
+      </w:r>
+      <w:r>
+        <w:rPr>
+          <w:rFonts w:ascii="Consolas" w:cs="Consolas" w:eastAsia="Consolas" w:hAnsi="Consolas"/>
+          <w:color w:val="1F4E79"/>
+        </w:rPr>
+        <w:t xml:space="preserve">&lt;button&gt;</w:t>
+      </w:r>
+      <w:r>
+        <w:t xml:space="preserve"> sin acción o un </w:t>
+      </w:r>
+      <w:r>
+        <w:rPr>
+          <w:rFonts w:ascii="Consolas" w:cs="Consolas" w:eastAsia="Consolas" w:hAnsi="Consolas"/>
+          <w:color w:val="1F4E79"/>
+        </w:rPr>
+        <w:t xml:space="preserve">&lt;a href="#"&gt;</w:t>
+      </w:r>
+      <w:r>
+        <w:t xml:space="preserve">). Se corrigió en </w:t>
+      </w:r>
+      <w:r>
+        <w:rPr>
+          <w:rFonts w:ascii="Consolas" w:cs="Consolas" w:eastAsia="Consolas" w:hAnsi="Consolas"/>
+          <w:color w:val="1F4E79"/>
+        </w:rPr>
+        <w:t xml:space="preserve">CourseCard.jsx</w:t>
       </w:r>
       <w:r>
         <w:t xml:space="preserve">, </w:t>
@@ -2277,27 +2631,179 @@
           <w:rFonts w:ascii="Consolas" w:cs="Consolas" w:eastAsia="Consolas" w:hAnsi="Consolas"/>
           <w:color w:val="1F4E79"/>
         </w:rPr>
-        <w:t xml:space="preserve">InscripcionPage.jsx</w:t>
-      </w:r>
-      <w:r>
-        <w:t xml:space="preserve"> e imágenes heroInscripcion), el color de fondo propio (</w:t>
-      </w:r>
-      <w:r>
-        <w:rPr>
-          <w:rFonts w:ascii="Consolas" w:cs="Consolas" w:eastAsia="Consolas" w:hAnsi="Consolas"/>
-          <w:color w:val="1F4E79"/>
-        </w:rPr>
-        <w:t xml:space="preserve">index.css</w:t>
-      </w:r>
-      <w:r>
-        <w:t xml:space="preserve"> y las cuatro páginas) y los cambios en </w:t>
-      </w:r>
-      <w:r>
-        <w:rPr>
-          <w:rFonts w:ascii="Consolas" w:cs="Consolas" w:eastAsia="Consolas" w:hAnsi="Consolas"/>
-          <w:color w:val="1F4E79"/>
-        </w:rPr>
-        <w:t xml:space="preserve">App.jsx</w:t>
+        <w:t xml:space="preserve">TallerCard.jsx</w:t>
+      </w:r>
+      <w:r>
+        <w:t xml:space="preserve">, </w:t>
+      </w:r>
+      <w:r>
+        <w:rPr>
+          <w:rFonts w:ascii="Consolas" w:cs="Consolas" w:eastAsia="Consolas" w:hAnsi="Consolas"/>
+          <w:color w:val="1F4E79"/>
+        </w:rPr>
+        <w:t xml:space="preserve">EventoRow.jsx</w:t>
+      </w:r>
+      <w:r>
+        <w:t xml:space="preserve"> y el botón general de </w:t>
+      </w:r>
+      <w:r>
+        <w:rPr>
+          <w:rFonts w:ascii="Consolas" w:cs="Consolas" w:eastAsia="Consolas" w:hAnsi="Consolas"/>
+          <w:color w:val="1F4E79"/>
+        </w:rPr>
+        <w:t xml:space="preserve">AgendaTalleres.jsx</w:t>
+      </w:r>
+      <w:r>
+        <w:t xml:space="preserve">, usando </w:t>
+      </w:r>
+      <w:r>
+        <w:rPr>
+          <w:rFonts w:ascii="Consolas" w:cs="Consolas" w:eastAsia="Consolas" w:hAnsi="Consolas"/>
+          <w:color w:val="1F4E79"/>
+        </w:rPr>
+        <w:t xml:space="preserve">Link</w:t>
+      </w:r>
+      <w:r>
+        <w:t xml:space="preserve"> de React Router hacia </w:t>
+      </w:r>
+      <w:r>
+        <w:rPr>
+          <w:rFonts w:ascii="Consolas" w:cs="Consolas" w:eastAsia="Consolas" w:hAnsi="Consolas"/>
+          <w:color w:val="1F4E79"/>
+        </w:rPr>
+        <w:t xml:space="preserve">/registro</w:t>
+      </w:r>
+      <w:r>
+        <w:t xml:space="preserve">.</w:t>
+      </w:r>
+    </w:p>
+    <w:p>
+      <w:pPr>
+        <w:pStyle w:val="ListParagraph"/>
+        <w:numPr>
+          <w:ilvl w:val="0"/>
+          <w:numId w:val="2"/>
+        </w:numPr>
+        <w:spacing w:after="60"/>
+      </w:pPr>
+      <w:r>
+        <w:t xml:space="preserve">Cada tarjeta enlaza además con el identificador de esa actividad como parámetro en la URL (por ejemplo </w:t>
+      </w:r>
+      <w:r>
+        <w:rPr>
+          <w:rFonts w:ascii="Consolas" w:cs="Consolas" w:eastAsia="Consolas" w:hAnsi="Consolas"/>
+          <w:color w:val="1F4E79"/>
+        </w:rPr>
+        <w:t xml:space="preserve">/registro?actividad=curso-3</w:t>
+      </w:r>
+      <w:r>
+        <w:t xml:space="preserve">), y </w:t>
+      </w:r>
+      <w:r>
+        <w:rPr>
+          <w:rFonts w:ascii="Consolas" w:cs="Consolas" w:eastAsia="Consolas" w:hAnsi="Consolas"/>
+          <w:color w:val="1F4E79"/>
+        </w:rPr>
+        <w:t xml:space="preserve">FormularioInscripcion.jsx</w:t>
+      </w:r>
+      <w:r>
+        <w:t xml:space="preserve"> lee ese parámetro con </w:t>
+      </w:r>
+      <w:r>
+        <w:rPr>
+          <w:rFonts w:ascii="Consolas" w:cs="Consolas" w:eastAsia="Consolas" w:hAnsi="Consolas"/>
+          <w:color w:val="1F4E79"/>
+        </w:rPr>
+        <w:t xml:space="preserve">useSearchParams</w:t>
+      </w:r>
+      <w:r>
+        <w:t xml:space="preserve"> para preseleccionar automáticamente esa opción en el formulario. Las actividades con cupo agotado se mantienen como botón deshabilitado, sin enlace.</w:t>
+      </w:r>
+    </w:p>
+    <w:p>
+      <w:pPr>
+        <w:pStyle w:val="Heading2"/>
+        <w:spacing w:after="120" w:before="280"/>
+      </w:pPr>
+      <w:r>
+        <w:rPr>
+          <w:b/>
+          <w:bCs/>
+        </w:rPr>
+        <w:t xml:space="preserve">24. Estado actual y pendientes</w:t>
+      </w:r>
+    </w:p>
+    <w:p>
+      <w:pPr>
+        <w:pStyle w:val="ListParagraph"/>
+        <w:numPr>
+          <w:ilvl w:val="0"/>
+          <w:numId w:val="2"/>
+        </w:numPr>
+        <w:spacing w:after="60"/>
+      </w:pPr>
+      <w:r>
+        <w:t xml:space="preserve">Historial de commits en GitHub: "Primera version del frontend: seccion de Cursos", "Cambios en hero, footer y arquitectura", "Borrador de Talleres", "Borrador de Eventos", "Actualizacion del footer", "Codificacion de la pagina de inscripcion" y "Actualizacion de formato de titulos de secciones".</w:t>
+      </w:r>
+    </w:p>
+    <w:p>
+      <w:pPr>
+        <w:pStyle w:val="ListParagraph"/>
+        <w:numPr>
+          <w:ilvl w:val="0"/>
+          <w:numId w:val="2"/>
+        </w:numPr>
+        <w:spacing w:after="60"/>
+      </w:pPr>
+      <w:r>
+        <w:t xml:space="preserve">Sin subir aún: los enlaces "Inscribirme" funcionales (sección 23) — </w:t>
+      </w:r>
+      <w:r>
+        <w:rPr>
+          <w:rFonts w:ascii="Consolas" w:cs="Consolas" w:eastAsia="Consolas" w:hAnsi="Consolas"/>
+          <w:color w:val="1F4E79"/>
+        </w:rPr>
+        <w:t xml:space="preserve">CourseCard.jsx</w:t>
+      </w:r>
+      <w:r>
+        <w:t xml:space="preserve">, </w:t>
+      </w:r>
+      <w:r>
+        <w:rPr>
+          <w:rFonts w:ascii="Consolas" w:cs="Consolas" w:eastAsia="Consolas" w:hAnsi="Consolas"/>
+          <w:color w:val="1F4E79"/>
+        </w:rPr>
+        <w:t xml:space="preserve">TallerCard.jsx</w:t>
+      </w:r>
+      <w:r>
+        <w:t xml:space="preserve">, </w:t>
+      </w:r>
+      <w:r>
+        <w:rPr>
+          <w:rFonts w:ascii="Consolas" w:cs="Consolas" w:eastAsia="Consolas" w:hAnsi="Consolas"/>
+          <w:color w:val="1F4E79"/>
+        </w:rPr>
+        <w:t xml:space="preserve">EventoRow.jsx</w:t>
+      </w:r>
+      <w:r>
+        <w:t xml:space="preserve">, </w:t>
+      </w:r>
+      <w:r>
+        <w:rPr>
+          <w:rFonts w:ascii="Consolas" w:cs="Consolas" w:eastAsia="Consolas" w:hAnsi="Consolas"/>
+          <w:color w:val="1F4E79"/>
+        </w:rPr>
+        <w:t xml:space="preserve">AgendaTalleres.jsx</w:t>
+      </w:r>
+      <w:r>
+        <w:t xml:space="preserve">, </w:t>
+      </w:r>
+      <w:r>
+        <w:rPr>
+          <w:rFonts w:ascii="Consolas" w:cs="Consolas" w:eastAsia="Consolas" w:hAnsi="Consolas"/>
+          <w:color w:val="1F4E79"/>
+        </w:rPr>
+        <w:t xml:space="preserve">FormularioInscripcion.jsx</w:t>
       </w:r>
       <w:r>
         <w:t xml:space="preserve"> y </w:t>
@@ -2307,7 +2813,7 @@
           <w:rFonts w:ascii="Consolas" w:cs="Consolas" w:eastAsia="Consolas" w:hAnsi="Consolas"/>
           <w:color w:val="1F4E79"/>
         </w:rPr>
-        <w:t xml:space="preserve">Navbar.jsx</w:t>
+        <w:t xml:space="preserve">Proceso.jsx</w:t>
       </w:r>
       <w:r>
         <w:t xml:space="preserve">.</w:t>
@@ -2323,7 +2829,7 @@
         <w:spacing w:after="60"/>
       </w:pPr>
       <w:r>
-        <w:t xml:space="preserve">Pendiente: optimizar el peso de las imágenes (</w:t>
+        <w:t xml:space="preserve">Pendiente: optimizar el peso de varias imágenes (</w:t>
       </w:r>
       <w:r>
         <w:rPr>
@@ -2343,7 +2849,7 @@
         <w:t xml:space="preserve">heroEventos.jpg</w:t>
       </w:r>
       <w:r>
-        <w:t xml:space="preserve"> y </w:t>
+        <w:t xml:space="preserve">, </w:t>
       </w:r>
       <w:r>
         <w:rPr>
@@ -2353,7 +2859,17 @@
         <w:t xml:space="preserve">agenda.jpg</w:t>
       </w:r>
       <w:r>
-        <w:t xml:space="preserve">, de 2.8 a 4 MB).</w:t>
+        <w:t xml:space="preserve"> e </w:t>
+      </w:r>
+      <w:r>
+        <w:rPr>
+          <w:rFonts w:ascii="Consolas" w:cs="Consolas" w:eastAsia="Consolas" w:hAnsi="Consolas"/>
+          <w:color w:val="1F4E79"/>
+        </w:rPr>
+        <w:t xml:space="preserve">imagen2.jpg</w:t>
+      </w:r>
+      <w:r>
+        <w:t xml:space="preserve">, entre 2.8 y 4.8 MB cada una).</w:t>
       </w:r>
     </w:p>
     <w:p>

</xml_diff>

<commit_message>
Importe y use lucide-react para reemplazar trazos por iconos
</commit_message>
<xml_diff>
--- a/frontend/Orden-de-creacion-frontend.docx
+++ b/frontend/Orden-de-creacion-frontend.docx
@@ -2730,40 +2730,100 @@
           <w:b/>
           <w:bCs/>
         </w:rPr>
-        <w:t xml:space="preserve">24. Estado actual y pendientes</w:t>
-      </w:r>
-    </w:p>
-    <w:p>
-      <w:pPr>
-        <w:pStyle w:val="ListParagraph"/>
-        <w:numPr>
-          <w:ilvl w:val="0"/>
-          <w:numId w:val="2"/>
-        </w:numPr>
-        <w:spacing w:after="60"/>
-      </w:pPr>
-      <w:r>
-        <w:t xml:space="preserve">Historial de commits en GitHub: "Primera version del frontend: seccion de Cursos", "Cambios en hero, footer y arquitectura", "Borrador de Talleres", "Borrador de Eventos", "Actualizacion del footer", "Codificacion de la pagina de inscripcion" y "Actualizacion de formato de titulos de secciones".</w:t>
-      </w:r>
-    </w:p>
-    <w:p>
-      <w:pPr>
-        <w:pStyle w:val="ListParagraph"/>
-        <w:numPr>
-          <w:ilvl w:val="0"/>
-          <w:numId w:val="2"/>
-        </w:numPr>
-        <w:spacing w:after="60"/>
-      </w:pPr>
-      <w:r>
-        <w:t xml:space="preserve">Sin subir aún: los enlaces "Inscribirme" funcionales (sección 23) — </w:t>
-      </w:r>
-      <w:r>
-        <w:rPr>
-          <w:rFonts w:ascii="Consolas" w:cs="Consolas" w:eastAsia="Consolas" w:hAnsi="Consolas"/>
-          <w:color w:val="1F4E79"/>
-        </w:rPr>
-        <w:t xml:space="preserve">CourseCard.jsx</w:t>
+        <w:t xml:space="preserve">24. Sección de contacto: canales y redes sociales</w:t>
+      </w:r>
+    </w:p>
+    <w:p>
+      <w:pPr>
+        <w:pStyle w:val="ListParagraph"/>
+        <w:numPr>
+          <w:ilvl w:val="0"/>
+          <w:numId w:val="2"/>
+        </w:numPr>
+        <w:spacing w:after="60"/>
+      </w:pPr>
+      <w:r>
+        <w:rPr>
+          <w:rFonts w:ascii="Consolas" w:cs="Consolas" w:eastAsia="Consolas" w:hAnsi="Consolas"/>
+          <w:color w:val="1F4E79"/>
+        </w:rPr>
+        <w:t xml:space="preserve">src/components/Contacto.jsx</w:t>
+      </w:r>
+      <w:r>
+        <w:t xml:space="preserve"> — se quitó la tarjeta "Oficina" y, en su lugar, se agregaron canales de contacto reales: correo (hola@beaken.mx), teléfono con enlace a WhatsApp, y Telegram (@Soportebeakenbot). La cuadrícula pasó de 3 a 4 columnas.</w:t>
+      </w:r>
+    </w:p>
+    <w:p>
+      <w:pPr>
+        <w:pStyle w:val="ListParagraph"/>
+        <w:numPr>
+          <w:ilvl w:val="0"/>
+          <w:numId w:val="2"/>
+        </w:numPr>
+        <w:spacing w:after="60"/>
+      </w:pPr>
+      <w:r>
+        <w:t xml:space="preserve">Se agregó una tarjeta "Redes sociales" con enlaces a Facebook e Instagram (se pidió también Telegram, que quedó como canal propio). Los enlaces que empiezan con </w:t>
+      </w:r>
+      <w:r>
+        <w:rPr>
+          <w:rFonts w:ascii="Consolas" w:cs="Consolas" w:eastAsia="Consolas" w:hAnsi="Consolas"/>
+          <w:color w:val="1F4E79"/>
+        </w:rPr>
+        <w:t xml:space="preserve">http</w:t>
+      </w:r>
+      <w:r>
+        <w:t xml:space="preserve"> se abren en una pestaña nueva (</w:t>
+      </w:r>
+      <w:r>
+        <w:rPr>
+          <w:rFonts w:ascii="Consolas" w:cs="Consolas" w:eastAsia="Consolas" w:hAnsi="Consolas"/>
+          <w:color w:val="1F4E79"/>
+        </w:rPr>
+        <w:t xml:space="preserve">target="_blank"</w:t>
+      </w:r>
+      <w:r>
+        <w:t xml:space="preserve"> y </w:t>
+      </w:r>
+      <w:r>
+        <w:rPr>
+          <w:rFonts w:ascii="Consolas" w:cs="Consolas" w:eastAsia="Consolas" w:hAnsi="Consolas"/>
+          <w:color w:val="1F4E79"/>
+        </w:rPr>
+        <w:t xml:space="preserve">rel="noopener noreferrer"</w:t>
+      </w:r>
+      <w:r>
+        <w:t xml:space="preserve">) y el texto de la sección se ajustó para mencionar WhatsApp, Instagram, Facebook y Telegram.</w:t>
+      </w:r>
+    </w:p>
+    <w:p>
+      <w:pPr>
+        <w:pStyle w:val="ListParagraph"/>
+        <w:numPr>
+          <w:ilvl w:val="0"/>
+          <w:numId w:val="2"/>
+        </w:numPr>
+        <w:spacing w:after="60"/>
+      </w:pPr>
+      <w:r>
+        <w:t xml:space="preserve">Los íconos se dibujaron primero como trazos SVG dentro del código; por ser poco legibles, se reemplazaron por imágenes guardadas en </w:t>
+      </w:r>
+      <w:r>
+        <w:rPr>
+          <w:rFonts w:ascii="Consolas" w:cs="Consolas" w:eastAsia="Consolas" w:hAnsi="Consolas"/>
+          <w:color w:val="1F4E79"/>
+        </w:rPr>
+        <w:t xml:space="preserve">src/assets/images/icons/</w:t>
+      </w:r>
+      <w:r>
+        <w:t xml:space="preserve"> (</w:t>
+      </w:r>
+      <w:r>
+        <w:rPr>
+          <w:rFonts w:ascii="Consolas" w:cs="Consolas" w:eastAsia="Consolas" w:hAnsi="Consolas"/>
+          <w:color w:val="1F4E79"/>
+        </w:rPr>
+        <w:t xml:space="preserve">mail.png</w:t>
       </w:r>
       <w:r>
         <w:t xml:space="preserve">, </w:t>
@@ -2773,7 +2833,7 @@
           <w:rFonts w:ascii="Consolas" w:cs="Consolas" w:eastAsia="Consolas" w:hAnsi="Consolas"/>
           <w:color w:val="1F4E79"/>
         </w:rPr>
-        <w:t xml:space="preserve">TallerCard.jsx</w:t>
+        <w:t xml:space="preserve">wap.webp</w:t>
       </w:r>
       <w:r>
         <w:t xml:space="preserve">, </w:t>
@@ -2783,7 +2843,7 @@
           <w:rFonts w:ascii="Consolas" w:cs="Consolas" w:eastAsia="Consolas" w:hAnsi="Consolas"/>
           <w:color w:val="1F4E79"/>
         </w:rPr>
-        <w:t xml:space="preserve">EventoRow.jsx</w:t>
+        <w:t xml:space="preserve">telegram.svg</w:t>
       </w:r>
       <w:r>
         <w:t xml:space="preserve">, </w:t>
@@ -2793,7 +2853,7 @@
           <w:rFonts w:ascii="Consolas" w:cs="Consolas" w:eastAsia="Consolas" w:hAnsi="Consolas"/>
           <w:color w:val="1F4E79"/>
         </w:rPr>
-        <w:t xml:space="preserve">AgendaTalleres.jsx</w:t>
+        <w:t xml:space="preserve">facebook.webp</w:t>
       </w:r>
       <w:r>
         <w:t xml:space="preserve">, </w:t>
@@ -2803,7 +2863,7 @@
           <w:rFonts w:ascii="Consolas" w:cs="Consolas" w:eastAsia="Consolas" w:hAnsi="Consolas"/>
           <w:color w:val="1F4E79"/>
         </w:rPr>
-        <w:t xml:space="preserve">FormularioInscripcion.jsx</w:t>
+        <w:t xml:space="preserve">instagram.png</w:t>
       </w:r>
       <w:r>
         <w:t xml:space="preserve"> y </w:t>
@@ -2813,10 +2873,381 @@
           <w:rFonts w:ascii="Consolas" w:cs="Consolas" w:eastAsia="Consolas" w:hAnsi="Consolas"/>
           <w:color w:val="1F4E79"/>
         </w:rPr>
+        <w:t xml:space="preserve">follow.png</w:t>
+      </w:r>
+      <w:r>
+        <w:t xml:space="preserve">), que se importan como el resto de las imágenes. Con esto los arreglos </w:t>
+      </w:r>
+      <w:r>
+        <w:rPr>
+          <w:rFonts w:ascii="Consolas" w:cs="Consolas" w:eastAsia="Consolas" w:hAnsi="Consolas"/>
+          <w:color w:val="1F4E79"/>
+        </w:rPr>
+        <w:t xml:space="preserve">canales</w:t>
+      </w:r>
+      <w:r>
+        <w:t xml:space="preserve"> y </w:t>
+      </w:r>
+      <w:r>
+        <w:rPr>
+          <w:rFonts w:ascii="Consolas" w:cs="Consolas" w:eastAsia="Consolas" w:hAnsi="Consolas"/>
+          <w:color w:val="1F4E79"/>
+        </w:rPr>
+        <w:t xml:space="preserve">redes</w:t>
+      </w:r>
+      <w:r>
+        <w:t xml:space="preserve"> quedaron con una línea por ícono.</w:t>
+      </w:r>
+    </w:p>
+    <w:p>
+      <w:pPr>
+        <w:pStyle w:val="ListParagraph"/>
+        <w:numPr>
+          <w:ilvl w:val="0"/>
+          <w:numId w:val="2"/>
+        </w:numPr>
+        <w:spacing w:after="60"/>
+      </w:pPr>
+      <w:r>
+        <w:t xml:space="preserve">Ajustes manuales posteriores: en </w:t>
+      </w:r>
+      <w:r>
+        <w:rPr>
+          <w:rFonts w:ascii="Consolas" w:cs="Consolas" w:eastAsia="Consolas" w:hAnsi="Consolas"/>
+          <w:color w:val="1F4E79"/>
+        </w:rPr>
+        <w:t xml:space="preserve">CtaBanner.jsx</w:t>
+      </w:r>
+      <w:r>
+        <w:t xml:space="preserve"> y </w:t>
+      </w:r>
+      <w:r>
+        <w:rPr>
+          <w:rFonts w:ascii="Consolas" w:cs="Consolas" w:eastAsia="Consolas" w:hAnsi="Consolas"/>
+          <w:color w:val="1F4E79"/>
+        </w:rPr>
         <w:t xml:space="preserve">Proceso.jsx</w:t>
       </w:r>
       <w:r>
+        <w:t xml:space="preserve"> se quitaron los botones secundarios ("Explorar" y "Más"), y en las preguntas frecuentes se ajustó el texto de la respuesta sobre pagos.</w:t>
+      </w:r>
+    </w:p>
+    <w:p>
+      <w:pPr>
+        <w:pStyle w:val="Heading2"/>
+        <w:spacing w:after="120" w:before="280"/>
+      </w:pPr>
+      <w:r>
+        <w:rPr>
+          <w:b/>
+          <w:bCs/>
+        </w:rPr>
+        <w:t xml:space="preserve">25. Íconos con librería (lucide-react)</w:t>
+      </w:r>
+    </w:p>
+    <w:p>
+      <w:pPr>
+        <w:pStyle w:val="ListParagraph"/>
+        <w:numPr>
+          <w:ilvl w:val="0"/>
+          <w:numId w:val="2"/>
+        </w:numPr>
+        <w:spacing w:after="60"/>
+      </w:pPr>
+      <w:r>
+        <w:t xml:space="preserve">Los íconos de las secciones Ventajas estaban dibujados como trazos SVG dentro de funciones del propio código, poco legibles. Se instaló la librería de íconos </w:t>
+      </w:r>
+      <w:r>
+        <w:rPr>
+          <w:rFonts w:ascii="Consolas" w:cs="Consolas" w:eastAsia="Consolas" w:hAnsi="Consolas"/>
+          <w:color w:val="1F4E79"/>
+        </w:rPr>
+        <w:t xml:space="preserve">lucide-react</w:t>
+      </w:r>
+      <w:r>
+        <w:t xml:space="preserve"> (dependencia agregada en </w:t>
+      </w:r>
+      <w:r>
+        <w:rPr>
+          <w:rFonts w:ascii="Consolas" w:cs="Consolas" w:eastAsia="Consolas" w:hAnsi="Consolas"/>
+          <w:color w:val="1F4E79"/>
+        </w:rPr>
+        <w:t xml:space="preserve">package.json</w:t>
+      </w:r>
+      <w:r>
+        <w:t xml:space="preserve">), elegida por tener el mismo estilo de línea que los íconos anteriores.</w:t>
+      </w:r>
+    </w:p>
+    <w:p>
+      <w:pPr>
+        <w:pStyle w:val="ListParagraph"/>
+        <w:numPr>
+          <w:ilvl w:val="0"/>
+          <w:numId w:val="2"/>
+        </w:numPr>
+        <w:spacing w:after="60"/>
+      </w:pPr>
+      <w:r>
+        <w:rPr>
+          <w:rFonts w:ascii="Consolas" w:cs="Consolas" w:eastAsia="Consolas" w:hAnsi="Consolas"/>
+          <w:color w:val="1F4E79"/>
+        </w:rPr>
+        <w:t xml:space="preserve">eventos/Ventajas.jsx</w:t>
+      </w:r>
+      <w:r>
+        <w:t xml:space="preserve"> — migrado a lucide: </w:t>
+      </w:r>
+      <w:r>
+        <w:rPr>
+          <w:rFonts w:ascii="Consolas" w:cs="Consolas" w:eastAsia="Consolas" w:hAnsi="Consolas"/>
+          <w:color w:val="1F4E79"/>
+        </w:rPr>
+        <w:t xml:space="preserve">Laptop</w:t>
+      </w:r>
+      <w:r>
+        <w:t xml:space="preserve">, </w:t>
+      </w:r>
+      <w:r>
+        <w:rPr>
+          <w:rFonts w:ascii="Consolas" w:cs="Consolas" w:eastAsia="Consolas" w:hAnsi="Consolas"/>
+          <w:color w:val="1F4E79"/>
+        </w:rPr>
+        <w:t xml:space="preserve">Tag</w:t>
+      </w:r>
+      <w:r>
+        <w:t xml:space="preserve">, </w:t>
+      </w:r>
+      <w:r>
+        <w:rPr>
+          <w:rFonts w:ascii="Consolas" w:cs="Consolas" w:eastAsia="Consolas" w:hAnsi="Consolas"/>
+          <w:color w:val="1F4E79"/>
+        </w:rPr>
+        <w:t xml:space="preserve">User</w:t>
+      </w:r>
+      <w:r>
+        <w:t xml:space="preserve">, </w:t>
+      </w:r>
+      <w:r>
+        <w:rPr>
+          <w:rFonts w:ascii="Consolas" w:cs="Consolas" w:eastAsia="Consolas" w:hAnsi="Consolas"/>
+          <w:color w:val="1F4E79"/>
+        </w:rPr>
+        <w:t xml:space="preserve">Users</w:t>
+      </w:r>
+      <w:r>
+        <w:t xml:space="preserve"> y </w:t>
+      </w:r>
+      <w:r>
+        <w:rPr>
+          <w:rFonts w:ascii="Consolas" w:cs="Consolas" w:eastAsia="Consolas" w:hAnsi="Consolas"/>
+          <w:color w:val="1F4E79"/>
+        </w:rPr>
+        <w:t xml:space="preserve">MessageCircle</w:t>
+      </w:r>
+      <w:r>
         <w:t xml:space="preserve">.</w:t>
+      </w:r>
+    </w:p>
+    <w:p>
+      <w:pPr>
+        <w:pStyle w:val="ListParagraph"/>
+        <w:numPr>
+          <w:ilvl w:val="0"/>
+          <w:numId w:val="2"/>
+        </w:numPr>
+        <w:spacing w:after="60"/>
+      </w:pPr>
+      <w:r>
+        <w:rPr>
+          <w:rFonts w:ascii="Consolas" w:cs="Consolas" w:eastAsia="Consolas" w:hAnsi="Consolas"/>
+          <w:color w:val="1F4E79"/>
+        </w:rPr>
+        <w:t xml:space="preserve">cursos/Ventajas.jsx</w:t>
+      </w:r>
+      <w:r>
+        <w:t xml:space="preserve"> — usa </w:t>
+      </w:r>
+      <w:r>
+        <w:rPr>
+          <w:rFonts w:ascii="Consolas" w:cs="Consolas" w:eastAsia="Consolas" w:hAnsi="Consolas"/>
+          <w:color w:val="1F4E79"/>
+        </w:rPr>
+        <w:t xml:space="preserve">Tag</w:t>
+      </w:r>
+      <w:r>
+        <w:t xml:space="preserve">, </w:t>
+      </w:r>
+      <w:r>
+        <w:rPr>
+          <w:rFonts w:ascii="Consolas" w:cs="Consolas" w:eastAsia="Consolas" w:hAnsi="Consolas"/>
+          <w:color w:val="1F4E79"/>
+        </w:rPr>
+        <w:t xml:space="preserve">User</w:t>
+      </w:r>
+      <w:r>
+        <w:t xml:space="preserve"> y </w:t>
+      </w:r>
+      <w:r>
+        <w:rPr>
+          <w:rFonts w:ascii="Consolas" w:cs="Consolas" w:eastAsia="Consolas" w:hAnsi="Consolas"/>
+          <w:color w:val="1F4E79"/>
+        </w:rPr>
+        <w:t xml:space="preserve">RefreshCw</w:t>
+      </w:r>
+      <w:r>
+        <w:t xml:space="preserve">; </w:t>
+      </w:r>
+      <w:r>
+        <w:rPr>
+          <w:rFonts w:ascii="Consolas" w:cs="Consolas" w:eastAsia="Consolas" w:hAnsi="Consolas"/>
+          <w:color w:val="1F4E79"/>
+        </w:rPr>
+        <w:t xml:space="preserve">talleres/Ventajas.jsx</w:t>
+      </w:r>
+      <w:r>
+        <w:t xml:space="preserve"> — usa </w:t>
+      </w:r>
+      <w:r>
+        <w:rPr>
+          <w:rFonts w:ascii="Consolas" w:cs="Consolas" w:eastAsia="Consolas" w:hAnsi="Consolas"/>
+          <w:color w:val="1F4E79"/>
+        </w:rPr>
+        <w:t xml:space="preserve">Infinity</w:t>
+      </w:r>
+      <w:r>
+        <w:t xml:space="preserve"> (importado como </w:t>
+      </w:r>
+      <w:r>
+        <w:rPr>
+          <w:rFonts w:ascii="Consolas" w:cs="Consolas" w:eastAsia="Consolas" w:hAnsi="Consolas"/>
+          <w:color w:val="1F4E79"/>
+        </w:rPr>
+        <w:t xml:space="preserve">InfinityIcon</w:t>
+      </w:r>
+      <w:r>
+        <w:t xml:space="preserve"> para no chocar con el </w:t>
+      </w:r>
+      <w:r>
+        <w:rPr>
+          <w:rFonts w:ascii="Consolas" w:cs="Consolas" w:eastAsia="Consolas" w:hAnsi="Consolas"/>
+          <w:color w:val="1F4E79"/>
+        </w:rPr>
+        <w:t xml:space="preserve">Infinity</w:t>
+      </w:r>
+      <w:r>
+        <w:t xml:space="preserve"> propio de JavaScript), </w:t>
+      </w:r>
+      <w:r>
+        <w:rPr>
+          <w:rFonts w:ascii="Consolas" w:cs="Consolas" w:eastAsia="Consolas" w:hAnsi="Consolas"/>
+          <w:color w:val="1F4E79"/>
+        </w:rPr>
+        <w:t xml:space="preserve">RefreshCw</w:t>
+      </w:r>
+      <w:r>
+        <w:t xml:space="preserve"> y </w:t>
+      </w:r>
+      <w:r>
+        <w:rPr>
+          <w:rFonts w:ascii="Consolas" w:cs="Consolas" w:eastAsia="Consolas" w:hAnsi="Consolas"/>
+          <w:color w:val="1F4E79"/>
+        </w:rPr>
+        <w:t xml:space="preserve">Headset</w:t>
+      </w:r>
+      <w:r>
+        <w:t xml:space="preserve">. Se eliminaron las funciones con trazos SVG de ambos archivos.</w:t>
+      </w:r>
+    </w:p>
+    <w:p>
+      <w:pPr>
+        <w:pStyle w:val="ListParagraph"/>
+        <w:numPr>
+          <w:ilvl w:val="0"/>
+          <w:numId w:val="2"/>
+        </w:numPr>
+        <w:spacing w:after="60"/>
+      </w:pPr>
+      <w:r>
+        <w:t xml:space="preserve">Al hacer el cambio en Cursos, quedaron referencias a funciones de íconos ya borradas, lo que rompía la página; se corrigió sustituyéndolas por los componentes de lucide y se verificó que Cursos, Talleres y Eventos carguen y dibujen sus íconos.</w:t>
+      </w:r>
+    </w:p>
+    <w:p>
+      <w:pPr>
+        <w:pStyle w:val="ListParagraph"/>
+        <w:numPr>
+          <w:ilvl w:val="0"/>
+          <w:numId w:val="2"/>
+        </w:numPr>
+        <w:spacing w:after="60"/>
+      </w:pPr>
+      <w:r>
+        <w:t xml:space="preserve">Se reestructuró </w:t>
+      </w:r>
+      <w:r>
+        <w:rPr>
+          <w:rFonts w:ascii="Consolas" w:cs="Consolas" w:eastAsia="Consolas" w:hAnsi="Consolas"/>
+          <w:color w:val="1F4E79"/>
+        </w:rPr>
+        <w:t xml:space="preserve">cursos/Ventajas.jsx</w:t>
+      </w:r>
+      <w:r>
+        <w:t xml:space="preserve"> para seguir la misma estructura que </w:t>
+      </w:r>
+      <w:r>
+        <w:rPr>
+          <w:rFonts w:ascii="Consolas" w:cs="Consolas" w:eastAsia="Consolas" w:hAnsi="Consolas"/>
+          <w:color w:val="1F4E79"/>
+        </w:rPr>
+        <w:t xml:space="preserve">talleres/Ventajas.jsx</w:t>
+      </w:r>
+      <w:r>
+        <w:t xml:space="preserve">: un arreglo </w:t>
+      </w:r>
+      <w:r>
+        <w:rPr>
+          <w:rFonts w:ascii="Consolas" w:cs="Consolas" w:eastAsia="Consolas" w:hAnsi="Consolas"/>
+          <w:color w:val="1F4E79"/>
+        </w:rPr>
+        <w:t xml:space="preserve">ventajas</w:t>
+      </w:r>
+      <w:r>
+        <w:t xml:space="preserve"> recorrido con </w:t>
+      </w:r>
+      <w:r>
+        <w:rPr>
+          <w:rFonts w:ascii="Consolas" w:cs="Consolas" w:eastAsia="Consolas" w:hAnsi="Consolas"/>
+          <w:color w:val="1F4E79"/>
+        </w:rPr>
+        <w:t xml:space="preserve">.map()</w:t>
+      </w:r>
+      <w:r>
+        <w:t xml:space="preserve"> en lugar de una tarjeta escrita a mano por cada ventaja, con la misma cuadrícula responsiva (2 columnas en tablet y 3 en pantalla grande). Se conservó el contenido de Cursos (Precios accesibles, Instructores especializados y Acceso a grabaciones), y la primera tarjeta pasó de llevar la etiqueta "Incluido" a llevar un ícono, como las demás. Los dos componentes se mantienen independientes.</w:t>
+      </w:r>
+    </w:p>
+    <w:p>
+      <w:pPr>
+        <w:pStyle w:val="Heading2"/>
+        <w:spacing w:after="120" w:before="280"/>
+      </w:pPr>
+      <w:r>
+        <w:rPr>
+          <w:b/>
+          <w:bCs/>
+        </w:rPr>
+        <w:t xml:space="preserve">26. Estado actual y pendientes</w:t>
+      </w:r>
+    </w:p>
+    <w:p>
+      <w:pPr>
+        <w:pStyle w:val="ListParagraph"/>
+        <w:numPr>
+          <w:ilvl w:val="0"/>
+          <w:numId w:val="2"/>
+        </w:numPr>
+        <w:spacing w:after="60"/>
+      </w:pPr>
+      <w:r>
+        <w:t xml:space="preserve">Historial de commits en GitHub: "Primera version del frontend: seccion de Cursos", "Cambios en hero, footer y arquitectura", "Borrador de Talleres", "Borrador de Eventos", "Actualizacion del footer", "Codificacion de la pagina de inscripcion", "Actualizacion de formato de titulos de secciones", "Botones de reinscripcion se redirigen a pagina de registro" y "Añadí canales de contacto (href) en sección de contacto". Sin subir aún: el cambio a íconos de lucide-react (sección 25) y este documento.</w:t>
       </w:r>
     </w:p>
     <w:p>

</xml_diff>

<commit_message>
Backend funcionando con postgresql
</commit_message>
<xml_diff>
--- a/frontend/Orden-de-creacion-frontend.docx
+++ b/frontend/Orden-de-creacion-frontend.docx
@@ -8,7 +8,7 @@
         <w:spacing w:after="80"/>
       </w:pPr>
       <w:r>
-        <w:t xml:space="preserve">Orden de creación del frontend — Beaken</w:t>
+        <w:t xml:space="preserve">Orden de creación del proyecto — Beaken</w:t>
       </w:r>
     </w:p>
     <w:p>
@@ -19,7 +19,7 @@
         <w:rPr>
           <w:color w:val="595959"/>
         </w:rPr>
-        <w:t xml:space="preserve">Registro breve del orden en que se fueron creando las carpetas y archivos dentro de la carpeta general "frontend", a nivel de codificación.</w:t>
+        <w:t xml:space="preserve">Registro breve del orden en que se fueron creando las carpetas y archivos del proyecto (frontend y backend), a nivel de codificación.</w:t>
       </w:r>
     </w:p>
     <w:p>
@@ -3234,20 +3234,1025 @@
           <w:b/>
           <w:bCs/>
         </w:rPr>
-        <w:t xml:space="preserve">26. Estado actual y pendientes</w:t>
-      </w:r>
-    </w:p>
-    <w:p>
-      <w:pPr>
-        <w:pStyle w:val="ListParagraph"/>
-        <w:numPr>
-          <w:ilvl w:val="0"/>
-          <w:numId w:val="2"/>
-        </w:numPr>
-        <w:spacing w:after="60"/>
-      </w:pPr>
-      <w:r>
-        <w:t xml:space="preserve">Historial de commits en GitHub: "Primera version del frontend: seccion de Cursos", "Cambios en hero, footer y arquitectura", "Borrador de Talleres", "Borrador de Eventos", "Actualizacion del footer", "Codificacion de la pagina de inscripcion", "Actualizacion de formato de titulos de secciones", "Botones de reinscripcion se redirigen a pagina de registro" y "Añadí canales de contacto (href) en sección de contacto". Sin subir aún: el cambio a íconos de lucide-react (sección 25) y este documento.</w:t>
+        <w:t xml:space="preserve">26. Backend: alcance y decisiones de la Fase 1</w:t>
+      </w:r>
+    </w:p>
+    <w:p>
+      <w:pPr>
+        <w:pStyle w:val="ListParagraph"/>
+        <w:numPr>
+          <w:ilvl w:val="0"/>
+          <w:numId w:val="2"/>
+        </w:numPr>
+        <w:spacing w:after="60"/>
+      </w:pPr>
+      <w:r>
+        <w:t xml:space="preserve">Para mostrar avance al cliente, lo construido hasta ese momento debía ser funcional: el catálogo (cursos, talleres y eventos) y las inscripciones pasan a leerse y guardarse en PostgreSQL en lugar de usar datos fijos del código. Se aplaza lo que falta del frontend.</w:t>
+      </w:r>
+    </w:p>
+    <w:p>
+      <w:pPr>
+        <w:pStyle w:val="ListParagraph"/>
+        <w:numPr>
+          <w:ilvl w:val="0"/>
+          <w:numId w:val="2"/>
+        </w:numPr>
+        <w:spacing w:after="60"/>
+      </w:pPr>
+      <w:r>
+        <w:t xml:space="preserve">El trabajo se dividió en dos fases: la Fase 1 (backend, base de datos, catálogos reales e inscripciones) y la Fase 2 (pagos con Mercado Pago, en modo de pruebas).</w:t>
+      </w:r>
+    </w:p>
+    <w:p>
+      <w:pPr>
+        <w:pStyle w:val="ListParagraph"/>
+        <w:numPr>
+          <w:ilvl w:val="0"/>
+          <w:numId w:val="2"/>
+        </w:numPr>
+        <w:spacing w:after="60"/>
+      </w:pPr>
+      <w:r>
+        <w:t xml:space="preserve">Plan de pagos para la Fase 2 (Checkout Pro de Mercado Pago): el backend registra la inscripción como pendiente de pago y solicita a Mercado Pago una preferencia de pago; la persona paga en la página de Mercado Pago, sin que los datos de la tarjeta pasen por el servidor propio; al regresar al sitio, el backend consulta a Mercado Pago el estado real del pago y actualiza la inscripción. En producción se sumaría un webhook.</w:t>
+      </w:r>
+    </w:p>
+    <w:p>
+      <w:pPr>
+        <w:pStyle w:val="ListParagraph"/>
+        <w:numPr>
+          <w:ilvl w:val="0"/>
+          <w:numId w:val="2"/>
+        </w:numPr>
+        <w:spacing w:after="60"/>
+      </w:pPr>
+      <w:r>
+        <w:t xml:space="preserve">Decisiones de la Fase 1: las actividades gratuitas se confirman al inscribirse y las de costo quedan en estado pendiente de pago; los scripts SQL los ejecuta el propio desarrollador en pgAdmin; y las credenciales de la base viven en un archivo de entorno fuera de git.</w:t>
+      </w:r>
+    </w:p>
+    <w:p>
+      <w:pPr>
+        <w:pStyle w:val="Heading2"/>
+        <w:spacing w:after="120" w:before="280"/>
+      </w:pPr>
+      <w:r>
+        <w:rPr>
+          <w:b/>
+          <w:bCs/>
+        </w:rPr>
+        <w:t xml:space="preserve">27. Esquema de la base de datos y datos de ejemplo</w:t>
+      </w:r>
+    </w:p>
+    <w:p>
+      <w:pPr>
+        <w:pStyle w:val="ListParagraph"/>
+        <w:numPr>
+          <w:ilvl w:val="0"/>
+          <w:numId w:val="2"/>
+        </w:numPr>
+        <w:spacing w:after="60"/>
+      </w:pPr>
+      <w:r>
+        <w:t xml:space="preserve">Se detectó que el esquema original no calzaba con el formulario de inscripción: la tabla de usuarios exigía contraseña o cuenta de Google, no había columna para el mensaje, ni tabla para el formulario de empresas.</w:t>
+      </w:r>
+    </w:p>
+    <w:p>
+      <w:pPr>
+        <w:pStyle w:val="ListParagraph"/>
+        <w:numPr>
+          <w:ilvl w:val="0"/>
+          <w:numId w:val="2"/>
+        </w:numPr>
+        <w:spacing w:after="60"/>
+      </w:pPr>
+      <w:r>
+        <w:rPr>
+          <w:rFonts w:ascii="Consolas" w:cs="Consolas" w:eastAsia="Consolas" w:hAnsi="Consolas"/>
+          <w:color w:val="1F4E79"/>
+        </w:rPr>
+        <w:t xml:space="preserve">schema_postgres.sql</w:t>
+      </w:r>
+      <w:r>
+        <w:t xml:space="preserve"> — se actualizó: se eliminó la restricción que exigía contraseña o Google en </w:t>
+      </w:r>
+      <w:r>
+        <w:rPr>
+          <w:rFonts w:ascii="Consolas" w:cs="Consolas" w:eastAsia="Consolas" w:hAnsi="Consolas"/>
+          <w:color w:val="1F4E79"/>
+        </w:rPr>
+        <w:t xml:space="preserve">usuarios</w:t>
+      </w:r>
+      <w:r>
+        <w:t xml:space="preserve"> (el login futuro reutilizará al usuario ya creado por su correo); se agregó la columna </w:t>
+      </w:r>
+      <w:r>
+        <w:rPr>
+          <w:rFonts w:ascii="Consolas" w:cs="Consolas" w:eastAsia="Consolas" w:hAnsi="Consolas"/>
+          <w:color w:val="1F4E79"/>
+        </w:rPr>
+        <w:t xml:space="preserve">mensaje</w:t>
+      </w:r>
+      <w:r>
+        <w:t xml:space="preserve"> a </w:t>
+      </w:r>
+      <w:r>
+        <w:rPr>
+          <w:rFonts w:ascii="Consolas" w:cs="Consolas" w:eastAsia="Consolas" w:hAnsi="Consolas"/>
+          <w:color w:val="1F4E79"/>
+        </w:rPr>
+        <w:t xml:space="preserve">inscripciones</w:t>
+      </w:r>
+      <w:r>
+        <w:t xml:space="preserve">; se creó la tabla </w:t>
+      </w:r>
+      <w:r>
+        <w:rPr>
+          <w:rFonts w:ascii="Consolas" w:cs="Consolas" w:eastAsia="Consolas" w:hAnsi="Consolas"/>
+          <w:color w:val="1F4E79"/>
+        </w:rPr>
+        <w:t xml:space="preserve">solicitudes_empresa</w:t>
+      </w:r>
+      <w:r>
+        <w:t xml:space="preserve">; se agregó </w:t>
+      </w:r>
+      <w:r>
+        <w:rPr>
+          <w:rFonts w:ascii="Consolas" w:cs="Consolas" w:eastAsia="Consolas" w:hAnsi="Consolas"/>
+          <w:color w:val="1F4E79"/>
+        </w:rPr>
+        <w:t xml:space="preserve">preferencia_id</w:t>
+      </w:r>
+      <w:r>
+        <w:t xml:space="preserve"> a </w:t>
+      </w:r>
+      <w:r>
+        <w:rPr>
+          <w:rFonts w:ascii="Consolas" w:cs="Consolas" w:eastAsia="Consolas" w:hAnsi="Consolas"/>
+          <w:color w:val="1F4E79"/>
+        </w:rPr>
+        <w:t xml:space="preserve">pagos</w:t>
+      </w:r>
+      <w:r>
+        <w:t xml:space="preserve"> y el valor </w:t>
+      </w:r>
+      <w:r>
+        <w:rPr>
+          <w:rFonts w:ascii="Consolas" w:cs="Consolas" w:eastAsia="Consolas" w:hAnsi="Consolas"/>
+          <w:color w:val="1F4E79"/>
+        </w:rPr>
+        <w:t xml:space="preserve">efectivo</w:t>
+      </w:r>
+      <w:r>
+        <w:t xml:space="preserve"> al tipo de método de pago, ambos pensados para la Fase 2. Los comentarios de decisiones del encabezado se actualizaron.</w:t>
+      </w:r>
+    </w:p>
+    <w:p>
+      <w:pPr>
+        <w:pStyle w:val="ListParagraph"/>
+        <w:numPr>
+          <w:ilvl w:val="0"/>
+          <w:numId w:val="2"/>
+        </w:numPr>
+        <w:spacing w:after="60"/>
+      </w:pPr>
+      <w:r>
+        <w:rPr>
+          <w:rFonts w:ascii="Consolas" w:cs="Consolas" w:eastAsia="Consolas" w:hAnsi="Consolas"/>
+          <w:color w:val="1F4E79"/>
+        </w:rPr>
+        <w:t xml:space="preserve">seed_demo.sql</w:t>
+      </w:r>
+      <w:r>
+        <w:t xml:space="preserve"> — datos de demostración tomados de los datos de ejemplo del frontend: categorías, ubicaciones, 15 actividades (5 cursos, 5 talleres y 5 eventos), 45 usuarios de relleno y sus inscripciones confirmadas, para que los cupos y los "Sold out" sean reales. Termina con una consulta de verificación.</w:t>
+      </w:r>
+    </w:p>
+    <w:p>
+      <w:pPr>
+        <w:pStyle w:val="ListParagraph"/>
+        <w:numPr>
+          <w:ilvl w:val="0"/>
+          <w:numId w:val="2"/>
+        </w:numPr>
+        <w:spacing w:after="60"/>
+      </w:pPr>
+      <w:r>
+        <w:t xml:space="preserve">Ajustes a los datos de ejemplo: las fechas de los eventos (de 2024, ya vencidas) pasaron a octubre y noviembre de 2026; todas las actividades quedaron dentro de un mismo día, con duraciones de 2 a 6 horas (los talleres de Figma y de emprendedores pasaron de "2 semanas" y "2 días" a 4 y 3 horas); los talleres recibieron cupos; y se corrigieron algunos textos.</w:t>
+      </w:r>
+    </w:p>
+    <w:p>
+      <w:pPr>
+        <w:pStyle w:val="ListParagraph"/>
+        <w:numPr>
+          <w:ilvl w:val="0"/>
+          <w:numId w:val="2"/>
+        </w:numPr>
+        <w:spacing w:after="60"/>
+      </w:pPr>
+      <w:r>
+        <w:t xml:space="preserve">La duración no se guarda en la base: se calcula a partir de las fechas de inicio y fin. La base </w:t>
+      </w:r>
+      <w:r>
+        <w:rPr>
+          <w:rFonts w:ascii="Consolas" w:cs="Consolas" w:eastAsia="Consolas" w:hAnsi="Consolas"/>
+          <w:color w:val="1F4E79"/>
+        </w:rPr>
+        <w:t xml:space="preserve">beaken</w:t>
+      </w:r>
+      <w:r>
+        <w:t xml:space="preserve"> (PostgreSQL 18) la creó y pobló el desarrollador ejecutando ambos scripts en pgAdmin.</w:t>
+      </w:r>
+    </w:p>
+    <w:p>
+      <w:pPr>
+        <w:pStyle w:val="Heading2"/>
+        <w:spacing w:after="120" w:before="280"/>
+      </w:pPr>
+      <w:r>
+        <w:rPr>
+          <w:b/>
+          <w:bCs/>
+        </w:rPr>
+        <w:t xml:space="preserve">28. Backend (carpeta backend)</w:t>
+      </w:r>
+    </w:p>
+    <w:p>
+      <w:pPr>
+        <w:pStyle w:val="ListParagraph"/>
+        <w:numPr>
+          <w:ilvl w:val="0"/>
+          <w:numId w:val="2"/>
+        </w:numPr>
+        <w:spacing w:after="60"/>
+      </w:pPr>
+      <w:r>
+        <w:rPr>
+          <w:rFonts w:ascii="Consolas" w:cs="Consolas" w:eastAsia="Consolas" w:hAnsi="Consolas"/>
+          <w:color w:val="1F4E79"/>
+        </w:rPr>
+        <w:t xml:space="preserve">backend/</w:t>
+      </w:r>
+      <w:r>
+        <w:t xml:space="preserve"> — proyecto Node.js con Express 5, el controlador </w:t>
+      </w:r>
+      <w:r>
+        <w:rPr>
+          <w:rFonts w:ascii="Consolas" w:cs="Consolas" w:eastAsia="Consolas" w:hAnsi="Consolas"/>
+          <w:color w:val="1F4E79"/>
+        </w:rPr>
+        <w:t xml:space="preserve">pg</w:t>
+      </w:r>
+      <w:r>
+        <w:t xml:space="preserve"> y </w:t>
+      </w:r>
+      <w:r>
+        <w:rPr>
+          <w:rFonts w:ascii="Consolas" w:cs="Consolas" w:eastAsia="Consolas" w:hAnsi="Consolas"/>
+          <w:color w:val="1F4E79"/>
+        </w:rPr>
+        <w:t xml:space="preserve">cors</w:t>
+      </w:r>
+      <w:r>
+        <w:t xml:space="preserve">. Archivos: </w:t>
+      </w:r>
+      <w:r>
+        <w:rPr>
+          <w:rFonts w:ascii="Consolas" w:cs="Consolas" w:eastAsia="Consolas" w:hAnsi="Consolas"/>
+          <w:color w:val="1F4E79"/>
+        </w:rPr>
+        <w:t xml:space="preserve">package.json</w:t>
+      </w:r>
+      <w:r>
+        <w:t xml:space="preserve">, </w:t>
+      </w:r>
+      <w:r>
+        <w:rPr>
+          <w:rFonts w:ascii="Consolas" w:cs="Consolas" w:eastAsia="Consolas" w:hAnsi="Consolas"/>
+          <w:color w:val="1F4E79"/>
+        </w:rPr>
+        <w:t xml:space="preserve">.env.example</w:t>
+      </w:r>
+      <w:r>
+        <w:t xml:space="preserve"> (plantilla sin contraseña), </w:t>
+      </w:r>
+      <w:r>
+        <w:rPr>
+          <w:rFonts w:ascii="Consolas" w:cs="Consolas" w:eastAsia="Consolas" w:hAnsi="Consolas"/>
+          <w:color w:val="1F4E79"/>
+        </w:rPr>
+        <w:t xml:space="preserve">.gitignore</w:t>
+      </w:r>
+      <w:r>
+        <w:t xml:space="preserve"> (excluye </w:t>
+      </w:r>
+      <w:r>
+        <w:rPr>
+          <w:rFonts w:ascii="Consolas" w:cs="Consolas" w:eastAsia="Consolas" w:hAnsi="Consolas"/>
+          <w:color w:val="1F4E79"/>
+        </w:rPr>
+        <w:t xml:space="preserve">.env</w:t>
+      </w:r>
+      <w:r>
+        <w:t xml:space="preserve"> y </w:t>
+      </w:r>
+      <w:r>
+        <w:rPr>
+          <w:rFonts w:ascii="Consolas" w:cs="Consolas" w:eastAsia="Consolas" w:hAnsi="Consolas"/>
+          <w:color w:val="1F4E79"/>
+        </w:rPr>
+        <w:t xml:space="preserve">node_modules</w:t>
+      </w:r>
+      <w:r>
+        <w:t xml:space="preserve">). Las variables de entorno se leen con la opción nativa de Node, sin librerías adicionales.</w:t>
+      </w:r>
+    </w:p>
+    <w:p>
+      <w:pPr>
+        <w:pStyle w:val="ListParagraph"/>
+        <w:numPr>
+          <w:ilvl w:val="0"/>
+          <w:numId w:val="2"/>
+        </w:numPr>
+        <w:spacing w:after="60"/>
+      </w:pPr>
+      <w:r>
+        <w:rPr>
+          <w:rFonts w:ascii="Consolas" w:cs="Consolas" w:eastAsia="Consolas" w:hAnsi="Consolas"/>
+          <w:color w:val="1F4E79"/>
+        </w:rPr>
+        <w:t xml:space="preserve">src/server.js</w:t>
+      </w:r>
+      <w:r>
+        <w:t xml:space="preserve">, </w:t>
+      </w:r>
+      <w:r>
+        <w:rPr>
+          <w:rFonts w:ascii="Consolas" w:cs="Consolas" w:eastAsia="Consolas" w:hAnsi="Consolas"/>
+          <w:color w:val="1F4E79"/>
+        </w:rPr>
+        <w:t xml:space="preserve">src/app.js</w:t>
+      </w:r>
+      <w:r>
+        <w:t xml:space="preserve"> y </w:t>
+      </w:r>
+      <w:r>
+        <w:rPr>
+          <w:rFonts w:ascii="Consolas" w:cs="Consolas" w:eastAsia="Consolas" w:hAnsi="Consolas"/>
+          <w:color w:val="1F4E79"/>
+        </w:rPr>
+        <w:t xml:space="preserve">src/db.js</w:t>
+      </w:r>
+      <w:r>
+        <w:t xml:space="preserve"> — arranque del servidor, configuración de Express (CORS, JSON, rutas, manejo de errores) y conexión a PostgreSQL.</w:t>
+      </w:r>
+    </w:p>
+    <w:p>
+      <w:pPr>
+        <w:pStyle w:val="ListParagraph"/>
+        <w:numPr>
+          <w:ilvl w:val="0"/>
+          <w:numId w:val="2"/>
+        </w:numPr>
+        <w:spacing w:after="60"/>
+      </w:pPr>
+      <w:r>
+        <w:rPr>
+          <w:rFonts w:ascii="Consolas" w:cs="Consolas" w:eastAsia="Consolas" w:hAnsi="Consolas"/>
+          <w:color w:val="1F4E79"/>
+        </w:rPr>
+        <w:t xml:space="preserve">src/routes/actividades.js</w:t>
+      </w:r>
+      <w:r>
+        <w:t xml:space="preserve"> — </w:t>
+      </w:r>
+      <w:r>
+        <w:rPr>
+          <w:rFonts w:ascii="Consolas" w:cs="Consolas" w:eastAsia="Consolas" w:hAnsi="Consolas"/>
+          <w:color w:val="1F4E79"/>
+        </w:rPr>
+        <w:t xml:space="preserve">GET /api/actividades?tipo=</w:t>
+      </w:r>
+      <w:r>
+        <w:t xml:space="preserve"> (catálogo con categoría, ubicación, cupos, indicador de agotada, duración en horas e imagen) y </w:t>
+      </w:r>
+      <w:r>
+        <w:rPr>
+          <w:rFonts w:ascii="Consolas" w:cs="Consolas" w:eastAsia="Consolas" w:hAnsi="Consolas"/>
+          <w:color w:val="1F4E79"/>
+        </w:rPr>
+        <w:t xml:space="preserve">GET /api/categorias?tipo=</w:t>
+      </w:r>
+      <w:r>
+        <w:t xml:space="preserve"> (filtros).</w:t>
+      </w:r>
+    </w:p>
+    <w:p>
+      <w:pPr>
+        <w:pStyle w:val="ListParagraph"/>
+        <w:numPr>
+          <w:ilvl w:val="0"/>
+          <w:numId w:val="2"/>
+        </w:numPr>
+        <w:spacing w:after="60"/>
+      </w:pPr>
+      <w:r>
+        <w:rPr>
+          <w:rFonts w:ascii="Consolas" w:cs="Consolas" w:eastAsia="Consolas" w:hAnsi="Consolas"/>
+          <w:color w:val="1F4E79"/>
+        </w:rPr>
+        <w:t xml:space="preserve">src/routes/inscripciones.js</w:t>
+      </w:r>
+      <w:r>
+        <w:t xml:space="preserve"> — </w:t>
+      </w:r>
+      <w:r>
+        <w:rPr>
+          <w:rFonts w:ascii="Consolas" w:cs="Consolas" w:eastAsia="Consolas" w:hAnsi="Consolas"/>
+          <w:color w:val="1F4E79"/>
+        </w:rPr>
+        <w:t xml:space="preserve">POST /api/inscripciones</w:t>
+      </w:r>
+      <w:r>
+        <w:t xml:space="preserve">: valida los datos, y dentro de una transacción bloquea la actividad para evitar sobrecupo, busca o crea al usuario por correo sin sobrescribir datos existentes, rechaza con 409 si ya estaba inscrito o no hay cupo, con 404 si la actividad no existe, y guarda la inscripción como confirmada o pendiente de pago según el costo.</w:t>
+      </w:r>
+    </w:p>
+    <w:p>
+      <w:pPr>
+        <w:pStyle w:val="ListParagraph"/>
+        <w:numPr>
+          <w:ilvl w:val="0"/>
+          <w:numId w:val="2"/>
+        </w:numPr>
+        <w:spacing w:after="60"/>
+      </w:pPr>
+      <w:r>
+        <w:rPr>
+          <w:rFonts w:ascii="Consolas" w:cs="Consolas" w:eastAsia="Consolas" w:hAnsi="Consolas"/>
+          <w:color w:val="1F4E79"/>
+        </w:rPr>
+        <w:t xml:space="preserve">src/routes/empresas.js</w:t>
+      </w:r>
+      <w:r>
+        <w:t xml:space="preserve"> — </w:t>
+      </w:r>
+      <w:r>
+        <w:rPr>
+          <w:rFonts w:ascii="Consolas" w:cs="Consolas" w:eastAsia="Consolas" w:hAnsi="Consolas"/>
+          <w:color w:val="1F4E79"/>
+        </w:rPr>
+        <w:t xml:space="preserve">POST /api/empresas/interes</w:t>
+      </w:r>
+      <w:r>
+        <w:t xml:space="preserve">: guarda el correo del formulario de empresas. Además, </w:t>
+      </w:r>
+      <w:r>
+        <w:rPr>
+          <w:rFonts w:ascii="Consolas" w:cs="Consolas" w:eastAsia="Consolas" w:hAnsi="Consolas"/>
+          <w:color w:val="1F4E79"/>
+        </w:rPr>
+        <w:t xml:space="preserve">GET /api/health</w:t>
+      </w:r>
+      <w:r>
+        <w:t xml:space="preserve"> indica si hay conexión con la base.</w:t>
+      </w:r>
+    </w:p>
+    <w:p>
+      <w:pPr>
+        <w:pStyle w:val="ListParagraph"/>
+        <w:numPr>
+          <w:ilvl w:val="0"/>
+          <w:numId w:val="2"/>
+        </w:numPr>
+        <w:spacing w:after="60"/>
+      </w:pPr>
+      <w:r>
+        <w:rPr>
+          <w:rFonts w:ascii="Consolas" w:cs="Consolas" w:eastAsia="Consolas" w:hAnsi="Consolas"/>
+          <w:color w:val="1F4E79"/>
+        </w:rPr>
+        <w:t xml:space="preserve">src/utils/</w:t>
+      </w:r>
+      <w:r>
+        <w:t xml:space="preserve"> — </w:t>
+      </w:r>
+      <w:r>
+        <w:rPr>
+          <w:rFonts w:ascii="Consolas" w:cs="Consolas" w:eastAsia="Consolas" w:hAnsi="Consolas"/>
+          <w:color w:val="1F4E79"/>
+        </w:rPr>
+        <w:t xml:space="preserve">errors.js</w:t>
+      </w:r>
+      <w:r>
+        <w:t xml:space="preserve"> (errores HTTP), </w:t>
+      </w:r>
+      <w:r>
+        <w:rPr>
+          <w:rFonts w:ascii="Consolas" w:cs="Consolas" w:eastAsia="Consolas" w:hAnsi="Consolas"/>
+          <w:color w:val="1F4E79"/>
+        </w:rPr>
+        <w:t xml:space="preserve">duracion.js</w:t>
+      </w:r>
+      <w:r>
+        <w:t xml:space="preserve"> (formato de la duración) y </w:t>
+      </w:r>
+      <w:r>
+        <w:rPr>
+          <w:rFonts w:ascii="Consolas" w:cs="Consolas" w:eastAsia="Consolas" w:hAnsi="Consolas"/>
+          <w:color w:val="1F4E79"/>
+        </w:rPr>
+        <w:t xml:space="preserve">validar.js</w:t>
+      </w:r>
+      <w:r>
+        <w:t xml:space="preserve"> (validaciones). Todas las consultas son parametrizadas, el tamaño del cuerpo está limitado, CORS se restringe al origen del frontend y los errores internos no revelan detalles al cliente.</w:t>
+      </w:r>
+    </w:p>
+    <w:p>
+      <w:pPr>
+        <w:pStyle w:val="Heading2"/>
+        <w:spacing w:after="120" w:before="280"/>
+      </w:pPr>
+      <w:r>
+        <w:rPr>
+          <w:b/>
+          <w:bCs/>
+        </w:rPr>
+        <w:t xml:space="preserve">29. Conexión del frontend con el backend</w:t>
+      </w:r>
+    </w:p>
+    <w:p>
+      <w:pPr>
+        <w:pStyle w:val="ListParagraph"/>
+        <w:numPr>
+          <w:ilvl w:val="0"/>
+          <w:numId w:val="2"/>
+        </w:numPr>
+        <w:spacing w:after="60"/>
+      </w:pPr>
+      <w:r>
+        <w:rPr>
+          <w:rFonts w:ascii="Consolas" w:cs="Consolas" w:eastAsia="Consolas" w:hAnsi="Consolas"/>
+          <w:color w:val="1F4E79"/>
+        </w:rPr>
+        <w:t xml:space="preserve">vite.config.js</w:t>
+      </w:r>
+      <w:r>
+        <w:t xml:space="preserve"> — proxy de </w:t>
+      </w:r>
+      <w:r>
+        <w:rPr>
+          <w:rFonts w:ascii="Consolas" w:cs="Consolas" w:eastAsia="Consolas" w:hAnsi="Consolas"/>
+          <w:color w:val="1F4E79"/>
+        </w:rPr>
+        <w:t xml:space="preserve">/api</w:t>
+      </w:r>
+      <w:r>
+        <w:t xml:space="preserve"> hacia el backend en desarrollo. Archivos nuevos: </w:t>
+      </w:r>
+      <w:r>
+        <w:rPr>
+          <w:rFonts w:ascii="Consolas" w:cs="Consolas" w:eastAsia="Consolas" w:hAnsi="Consolas"/>
+          <w:color w:val="1F4E79"/>
+        </w:rPr>
+        <w:t xml:space="preserve">src/api/client.js</w:t>
+      </w:r>
+      <w:r>
+        <w:t xml:space="preserve"> (llamadas a la API y errores), </w:t>
+      </w:r>
+      <w:r>
+        <w:rPr>
+          <w:rFonts w:ascii="Consolas" w:cs="Consolas" w:eastAsia="Consolas" w:hAnsi="Consolas"/>
+          <w:color w:val="1F4E79"/>
+        </w:rPr>
+        <w:t xml:space="preserve">src/hooks/useFetch.js</w:t>
+      </w:r>
+      <w:r>
+        <w:t xml:space="preserve"> (carga de datos) y </w:t>
+      </w:r>
+      <w:r>
+        <w:rPr>
+          <w:rFonts w:ascii="Consolas" w:cs="Consolas" w:eastAsia="Consolas" w:hAnsi="Consolas"/>
+          <w:color w:val="1F4E79"/>
+        </w:rPr>
+        <w:t xml:space="preserve">src/components/EstadoCarga.jsx</w:t>
+      </w:r>
+      <w:r>
+        <w:t xml:space="preserve"> (mensajes de carga y de error).</w:t>
+      </w:r>
+    </w:p>
+    <w:p>
+      <w:pPr>
+        <w:pStyle w:val="ListParagraph"/>
+        <w:numPr>
+          <w:ilvl w:val="0"/>
+          <w:numId w:val="2"/>
+        </w:numPr>
+        <w:spacing w:after="60"/>
+      </w:pPr>
+      <w:r>
+        <w:rPr>
+          <w:rFonts w:ascii="Consolas" w:cs="Consolas" w:eastAsia="Consolas" w:hAnsi="Consolas"/>
+          <w:color w:val="1F4E79"/>
+        </w:rPr>
+        <w:t xml:space="preserve">AgendaCursos.jsx</w:t>
+      </w:r>
+      <w:r>
+        <w:t xml:space="preserve">, </w:t>
+      </w:r>
+      <w:r>
+        <w:rPr>
+          <w:rFonts w:ascii="Consolas" w:cs="Consolas" w:eastAsia="Consolas" w:hAnsi="Consolas"/>
+          <w:color w:val="1F4E79"/>
+        </w:rPr>
+        <w:t xml:space="preserve">AgendaEventos.jsx</w:t>
+      </w:r>
+      <w:r>
+        <w:t xml:space="preserve"> y </w:t>
+      </w:r>
+      <w:r>
+        <w:rPr>
+          <w:rFonts w:ascii="Consolas" w:cs="Consolas" w:eastAsia="Consolas" w:hAnsi="Consolas"/>
+          <w:color w:val="1F4E79"/>
+        </w:rPr>
+        <w:t xml:space="preserve">AgendaTalleres.jsx</w:t>
+      </w:r>
+      <w:r>
+        <w:t xml:space="preserve"> — leen del backend en lugar de arreglos fijos; </w:t>
+      </w:r>
+      <w:r>
+        <w:rPr>
+          <w:rFonts w:ascii="Consolas" w:cs="Consolas" w:eastAsia="Consolas" w:hAnsi="Consolas"/>
+          <w:color w:val="1F4E79"/>
+        </w:rPr>
+        <w:t xml:space="preserve">CourseCard.jsx</w:t>
+      </w:r>
+      <w:r>
+        <w:t xml:space="preserve"> y </w:t>
+      </w:r>
+      <w:r>
+        <w:rPr>
+          <w:rFonts w:ascii="Consolas" w:cs="Consolas" w:eastAsia="Consolas" w:hAnsi="Consolas"/>
+          <w:color w:val="1F4E79"/>
+        </w:rPr>
+        <w:t xml:space="preserve">EventoRow.jsx</w:t>
+      </w:r>
+      <w:r>
+        <w:t xml:space="preserve"> usan el indicador de agotada que calcula el servidor.</w:t>
+      </w:r>
+    </w:p>
+    <w:p>
+      <w:pPr>
+        <w:pStyle w:val="ListParagraph"/>
+        <w:numPr>
+          <w:ilvl w:val="0"/>
+          <w:numId w:val="2"/>
+        </w:numPr>
+        <w:spacing w:after="60"/>
+      </w:pPr>
+      <w:r>
+        <w:rPr>
+          <w:rFonts w:ascii="Consolas" w:cs="Consolas" w:eastAsia="Consolas" w:hAnsi="Consolas"/>
+          <w:color w:val="1F4E79"/>
+        </w:rPr>
+        <w:t xml:space="preserve">FormularioInscripcion.jsx</w:t>
+      </w:r>
+      <w:r>
+        <w:t xml:space="preserve"> — envía la inscripción al backend; el selector lista las actividades reales (las llenas deshabilitadas) y se preselecciona con el identificador que llega por la URL; muestra los errores por campo y el mensaje que devuelve el servidor. </w:t>
+      </w:r>
+      <w:r>
+        <w:rPr>
+          <w:rFonts w:ascii="Consolas" w:cs="Consolas" w:eastAsia="Consolas" w:hAnsi="Consolas"/>
+          <w:color w:val="1F4E79"/>
+        </w:rPr>
+        <w:t xml:space="preserve">FormularioEmpresa.jsx</w:t>
+      </w:r>
+      <w:r>
+        <w:t xml:space="preserve"> también guarda en la base.</w:t>
+      </w:r>
+    </w:p>
+    <w:p>
+      <w:pPr>
+        <w:pStyle w:val="ListParagraph"/>
+        <w:numPr>
+          <w:ilvl w:val="0"/>
+          <w:numId w:val="2"/>
+        </w:numPr>
+        <w:spacing w:after="60"/>
+      </w:pPr>
+      <w:r>
+        <w:t xml:space="preserve">Las fotos de los talleres pasaron de </w:t>
+      </w:r>
+      <w:r>
+        <w:rPr>
+          <w:rFonts w:ascii="Consolas" w:cs="Consolas" w:eastAsia="Consolas" w:hAnsi="Consolas"/>
+          <w:color w:val="1F4E79"/>
+        </w:rPr>
+        <w:t xml:space="preserve">src/assets/images/talleres/</w:t>
+      </w:r>
+      <w:r>
+        <w:t xml:space="preserve"> a </w:t>
+      </w:r>
+      <w:r>
+        <w:rPr>
+          <w:rFonts w:ascii="Consolas" w:cs="Consolas" w:eastAsia="Consolas" w:hAnsi="Consolas"/>
+          <w:color w:val="1F4E79"/>
+        </w:rPr>
+        <w:t xml:space="preserve">public/img/talleres/</w:t>
+      </w:r>
+      <w:r>
+        <w:t xml:space="preserve">, porque la base guarda su ruta. Se eliminó la carpeta </w:t>
+      </w:r>
+      <w:r>
+        <w:rPr>
+          <w:rFonts w:ascii="Consolas" w:cs="Consolas" w:eastAsia="Consolas" w:hAnsi="Consolas"/>
+          <w:color w:val="1F4E79"/>
+        </w:rPr>
+        <w:t xml:space="preserve">src/data/</w:t>
+      </w:r>
+      <w:r>
+        <w:t xml:space="preserve"> (los datos de ejemplo del frontend), que ya nada usaba.</w:t>
+      </w:r>
+    </w:p>
+    <w:p>
+      <w:pPr>
+        <w:pStyle w:val="Heading2"/>
+        <w:spacing w:after="120" w:before="280"/>
+      </w:pPr>
+      <w:r>
+        <w:rPr>
+          <w:b/>
+          <w:bCs/>
+        </w:rPr>
+        <w:t xml:space="preserve">30. Pruebas realizadas</w:t>
+      </w:r>
+    </w:p>
+    <w:p>
+      <w:pPr>
+        <w:pStyle w:val="ListParagraph"/>
+        <w:numPr>
+          <w:ilvl w:val="0"/>
+          <w:numId w:val="2"/>
+        </w:numPr>
+        <w:spacing w:after="60"/>
+      </w:pPr>
+      <w:r>
+        <w:t xml:space="preserve">Sin conexión a la base: validaciones (400), ruta inexistente (404), JSON inválido (400), verificación de salud (503) y error interno sin filtrar detalles (500).</w:t>
+      </w:r>
+    </w:p>
+    <w:p>
+      <w:pPr>
+        <w:pStyle w:val="ListParagraph"/>
+        <w:numPr>
+          <w:ilvl w:val="0"/>
+          <w:numId w:val="2"/>
+        </w:numPr>
+        <w:spacing w:after="60"/>
+      </w:pPr>
+      <w:r>
+        <w:t xml:space="preserve">Con la base real y ambos servidores: el catálogo devuelve 5 cursos, 5 talleres y 5 eventos, con los 3 agotados esperados y duraciones en horas; el proxy y las imágenes funcionan; las tres páginas cargan sin errores de consola.</w:t>
+      </w:r>
+    </w:p>
+    <w:p>
+      <w:pPr>
+        <w:pStyle w:val="ListParagraph"/>
+        <w:numPr>
+          <w:ilvl w:val="0"/>
+          <w:numId w:val="2"/>
+        </w:numPr>
+        <w:spacing w:after="60"/>
+      </w:pPr>
+      <w:r>
+        <w:t xml:space="preserve">Inscripción: éxito con confirmación y preselección desde la URL; rechazo por actividad llena, por inscripción duplicada y por actividad inexistente (sin escribir datos); y los cupos se actualizan tras inscribirse (de 5 a 6 inscritos en una actividad de prueba). El formulario de empresas guarda y rechaza correos inválidos.</w:t>
+      </w:r>
+    </w:p>
+    <w:p>
+      <w:pPr>
+        <w:pStyle w:val="ListParagraph"/>
+        <w:numPr>
+          <w:ilvl w:val="0"/>
+          <w:numId w:val="2"/>
+        </w:numPr>
+        <w:spacing w:after="60"/>
+      </w:pPr>
+      <w:r>
+        <w:t xml:space="preserve">Las pruebas visuales se hicieron leyendo el DOM de la página, porque en esa sesión el navegador integrado no devolvía capturas de pantalla.</w:t>
+      </w:r>
+    </w:p>
+    <w:p>
+      <w:pPr>
+        <w:pStyle w:val="Heading2"/>
+        <w:spacing w:after="120" w:before="280"/>
+      </w:pPr>
+      <w:r>
+        <w:rPr>
+          <w:b/>
+          <w:bCs/>
+        </w:rPr>
+        <w:t xml:space="preserve">31. Tecnologías utilizadas</w:t>
+      </w:r>
+    </w:p>
+    <w:p>
+      <w:pPr>
+        <w:pStyle w:val="ListParagraph"/>
+        <w:numPr>
+          <w:ilvl w:val="0"/>
+          <w:numId w:val="2"/>
+        </w:numPr>
+        <w:spacing w:after="60"/>
+      </w:pPr>
+      <w:r>
+        <w:t xml:space="preserve">Frontend: React 18.3.1, React Router 7, Vite 8, Tailwind CSS 4 (con prefijo </w:t>
+      </w:r>
+      <w:r>
+        <w:rPr>
+          <w:rFonts w:ascii="Consolas" w:cs="Consolas" w:eastAsia="Consolas" w:hAnsi="Consolas"/>
+          <w:color w:val="1F4E79"/>
+        </w:rPr>
+        <w:t xml:space="preserve">tw:</w:t>
+      </w:r>
+      <w:r>
+        <w:t xml:space="preserve">) y lucide-react.</w:t>
+      </w:r>
+    </w:p>
+    <w:p>
+      <w:pPr>
+        <w:pStyle w:val="ListParagraph"/>
+        <w:numPr>
+          <w:ilvl w:val="0"/>
+          <w:numId w:val="2"/>
+        </w:numPr>
+        <w:spacing w:after="60"/>
+      </w:pPr>
+      <w:r>
+        <w:t xml:space="preserve">Backend: Node.js 24, Express 5, controlador </w:t>
+      </w:r>
+      <w:r>
+        <w:rPr>
+          <w:rFonts w:ascii="Consolas" w:cs="Consolas" w:eastAsia="Consolas" w:hAnsi="Consolas"/>
+          <w:color w:val="1F4E79"/>
+        </w:rPr>
+        <w:t xml:space="preserve">pg</w:t>
+      </w:r>
+      <w:r>
+        <w:t xml:space="preserve"> y </w:t>
+      </w:r>
+      <w:r>
+        <w:rPr>
+          <w:rFonts w:ascii="Consolas" w:cs="Consolas" w:eastAsia="Consolas" w:hAnsi="Consolas"/>
+          <w:color w:val="1F4E79"/>
+        </w:rPr>
+        <w:t xml:space="preserve">cors</w:t>
+      </w:r>
+      <w:r>
+        <w:t xml:space="preserve">.</w:t>
+      </w:r>
+    </w:p>
+    <w:p>
+      <w:pPr>
+        <w:pStyle w:val="ListParagraph"/>
+        <w:numPr>
+          <w:ilvl w:val="0"/>
+          <w:numId w:val="2"/>
+        </w:numPr>
+        <w:spacing w:after="60"/>
+      </w:pPr>
+      <w:r>
+        <w:t xml:space="preserve">Base de datos: PostgreSQL 18, administrada con pgAdmin. Control de versiones: Git y GitHub.</w:t>
+      </w:r>
+    </w:p>
+    <w:p>
+      <w:pPr>
+        <w:pStyle w:val="ListParagraph"/>
+        <w:numPr>
+          <w:ilvl w:val="0"/>
+          <w:numId w:val="2"/>
+        </w:numPr>
+        <w:spacing w:after="60"/>
+      </w:pPr>
+      <w:r>
+        <w:t xml:space="preserve">Planeado para la Fase 2: Mercado Pago (Checkout Pro) para los pagos.</w:t>
+      </w:r>
+    </w:p>
+    <w:p>
+      <w:pPr>
+        <w:pStyle w:val="Heading2"/>
+        <w:spacing w:after="120" w:before="280"/>
+      </w:pPr>
+      <w:r>
+        <w:rPr>
+          <w:b/>
+          <w:bCs/>
+        </w:rPr>
+        <w:t xml:space="preserve">32. Estado actual y pendientes</w:t>
+      </w:r>
+    </w:p>
+    <w:p>
+      <w:pPr>
+        <w:pStyle w:val="ListParagraph"/>
+        <w:numPr>
+          <w:ilvl w:val="0"/>
+          <w:numId w:val="2"/>
+        </w:numPr>
+        <w:spacing w:after="60"/>
+      </w:pPr>
+      <w:r>
+        <w:t xml:space="preserve">Historial de commits en GitHub: "Primera version del frontend: seccion de Cursos", "Cambios en hero, footer y arquitectura", "Borrador de Talleres", "Borrador de Eventos", "Actualizacion del footer", "Codificacion de la pagina de inscripcion", "Actualizacion de formato de titulos de secciones", "Botones de reinscripcion se redirigen a pagina de registro", "Añadí canales de contacto (href) en sección de contacto" e "Importe y use lucide-react para reemplazar trazos por iconos". Sin subir aún: toda la Fase 1 (carpeta </w:t>
+      </w:r>
+      <w:r>
+        <w:rPr>
+          <w:rFonts w:ascii="Consolas" w:cs="Consolas" w:eastAsia="Consolas" w:hAnsi="Consolas"/>
+          <w:color w:val="1F4E79"/>
+        </w:rPr>
+        <w:t xml:space="preserve">backend/</w:t>
+      </w:r>
+      <w:r>
+        <w:t xml:space="preserve">, </w:t>
+      </w:r>
+      <w:r>
+        <w:rPr>
+          <w:rFonts w:ascii="Consolas" w:cs="Consolas" w:eastAsia="Consolas" w:hAnsi="Consolas"/>
+          <w:color w:val="1F4E79"/>
+        </w:rPr>
+        <w:t xml:space="preserve">seed_demo.sql</w:t>
+      </w:r>
+      <w:r>
+        <w:t xml:space="preserve">, los cambios de </w:t>
+      </w:r>
+      <w:r>
+        <w:rPr>
+          <w:rFonts w:ascii="Consolas" w:cs="Consolas" w:eastAsia="Consolas" w:hAnsi="Consolas"/>
+          <w:color w:val="1F4E79"/>
+        </w:rPr>
+        <w:t xml:space="preserve">schema_postgres.sql</w:t>
+      </w:r>
+      <w:r>
+        <w:t xml:space="preserve"> y la conexión del frontend) y este documento.</w:t>
+      </w:r>
+    </w:p>
+    <w:p>
+      <w:pPr>
+        <w:pStyle w:val="ListParagraph"/>
+        <w:numPr>
+          <w:ilvl w:val="0"/>
+          <w:numId w:val="2"/>
+        </w:numPr>
+        <w:spacing w:after="60"/>
+      </w:pPr>
+      <w:r>
+        <w:t xml:space="preserve">Pendiente: borrar de la base los datos de prueba (el usuario </w:t>
+      </w:r>
+      <w:r>
+        <w:rPr>
+          <w:rFonts w:ascii="Consolas" w:cs="Consolas" w:eastAsia="Consolas" w:hAnsi="Consolas"/>
+          <w:color w:val="1F4E79"/>
+        </w:rPr>
+        <w:t xml:space="preserve">prueba-borrar@beaken.demo</w:t>
+      </w:r>
+      <w:r>
+        <w:t xml:space="preserve"> con su inscripción, y </w:t>
+      </w:r>
+      <w:r>
+        <w:rPr>
+          <w:rFonts w:ascii="Consolas" w:cs="Consolas" w:eastAsia="Consolas" w:hAnsi="Consolas"/>
+          <w:color w:val="1F4E79"/>
+        </w:rPr>
+        <w:t xml:space="preserve">empresa-borrar@beaken.demo</w:t>
+      </w:r>
+      <w:r>
+        <w:t xml:space="preserve"> en </w:t>
+      </w:r>
+      <w:r>
+        <w:rPr>
+          <w:rFonts w:ascii="Consolas" w:cs="Consolas" w:eastAsia="Consolas" w:hAnsi="Consolas"/>
+          <w:color w:val="1F4E79"/>
+        </w:rPr>
+        <w:t xml:space="preserve">solicitudes_empresa</w:t>
+      </w:r>
+      <w:r>
+        <w:t xml:space="preserve">) antes de la demostración.</w:t>
+      </w:r>
+    </w:p>
+    <w:p>
+      <w:pPr>
+        <w:pStyle w:val="ListParagraph"/>
+        <w:numPr>
+          <w:ilvl w:val="0"/>
+          <w:numId w:val="2"/>
+        </w:numPr>
+        <w:spacing w:after="60"/>
+      </w:pPr>
+      <w:r>
+        <w:t xml:space="preserve">Pendiente: Fase 2 (pagos con Mercado Pago, en modo de pruebas), que requiere credenciales de prueba de Mercado Pago, una página de resultado de pago y la reserva de cupo para inscripciones pendientes de pago.</w:t>
+      </w:r>
+    </w:p>
+    <w:p>
+      <w:pPr>
+        <w:pStyle w:val="ListParagraph"/>
+        <w:numPr>
+          <w:ilvl w:val="0"/>
+          <w:numId w:val="2"/>
+        </w:numPr>
+        <w:spacing w:after="60"/>
+      </w:pPr>
+      <w:r>
+        <w:t xml:space="preserve">Pendiente: el catálogo no oculta actividades pasadas; definir si debe mostrar solo las próximas.</w:t>
       </w:r>
     </w:p>
     <w:p>
@@ -3313,20 +4318,20 @@
         <w:spacing w:after="60"/>
       </w:pPr>
       <w:r>
-        <w:t xml:space="preserve">Pendiente: decidir si se entregan certificados (el esquema de la base de datos eliminó esa tabla; ya se quitó la pregunta de las preguntas frecuentes, pero Ventajas aún menciona la certificación).</w:t>
-      </w:r>
-    </w:p>
-    <w:p>
-      <w:pPr>
-        <w:pStyle w:val="ListParagraph"/>
-        <w:numPr>
-          <w:ilvl w:val="0"/>
-          <w:numId w:val="2"/>
-        </w:numPr>
-        <w:spacing w:after="60"/>
-      </w:pPr>
-      <w:r>
-        <w:t xml:space="preserve">Siguientes pasos: página Networking, login, Mis cursos, pasada de pulido (menú móvil, títulos de pestaña, animaciones) y la conexión con la base de datos (fase de backend).</w:t>
+        <w:t xml:space="preserve">Pendiente: decidir si se entregan certificados (el esquema de la base de datos eliminó esa tabla, pero Ventajas aún menciona la certificación).</w:t>
+      </w:r>
+    </w:p>
+    <w:p>
+      <w:pPr>
+        <w:pStyle w:val="ListParagraph"/>
+        <w:numPr>
+          <w:ilvl w:val="0"/>
+          <w:numId w:val="2"/>
+        </w:numPr>
+        <w:spacing w:after="60"/>
+      </w:pPr>
+      <w:r>
+        <w:t xml:space="preserve">Siguientes pasos: página Networking, login (que reutilizará al usuario ya creado por correo, con verificación del correo), Mis cursos y una pasada de pulido (menú móvil, títulos de pestaña, animaciones).</w:t>
       </w:r>
     </w:p>
     <w:sectPr>

</xml_diff>